<commit_message>
feat(pekerjaan): support multiple registers per document type
- Added `findRegistersByType` to retrieve all matching registers.
- Removed duplication guard in `RegisterDokumen.tsx` to allow multiple entries.
- Updated UI table cells and Excel export to properly map and display multiple register numbers.
- Ensure progress tracking accommodates the new multi-register format.
- Added S3 connection settings and layout config changes.

Co-Authored-By: Claude Fable 5 <noreply@anthropic.com>
</commit_message>
<xml_diff>
--- a/docs/Kajian_Monitoring_Evaluasi_Implementasi_Arumanis.docx
+++ b/docs/Kajian_Monitoring_Evaluasi_Implementasi_Arumanis.docx
@@ -1,78 +1,7 @@
 
 <file path=word/document.xml><?xml version="1.0" encoding="utf-8"?>
-<w:document xmlns:wpc="http://schemas.microsoft.com/office/word/2010/wordprocessingCanvas" xmlns:cx="http://schemas.microsoft.com/office/drawing/2014/chartex" xmlns:cx1="http://schemas.microsoft.com/office/drawing/2015/9/8/chartex" xmlns:cx2="http://schemas.microsoft.com/office/drawing/2015/10/21/chartex" xmlns:cx3="http://schemas.microsoft.com/office/drawing/2016/5/9/chartex" xmlns:cx4="http://schemas.microsoft.com/office/drawing/2016/5/10/chartex" xmlns:cx5="http://schemas.microsoft.com/office/drawing/2016/5/11/chartex" xmlns:cx6="http://schemas.microsoft.com/office/drawing/2016/5/12/chartex" xmlns:cx7="http://schemas.microsoft.com/office/drawing/2016/5/13/chartex" xmlns:cx8="http://schemas.microsoft.com/office/drawing/2016/5/14/chartex" xmlns:mc="http://schemas.openxmlformats.org/markup-compatibility/2006" xmlns:aink="http://schemas.microsoft.com/office/drawing/2016/ink" xmlns:am3d="http://schemas.microsoft.com/office/drawing/2017/model3d" xmlns:o="urn:schemas-microsoft-com:office:office" xmlns:oel="http://schemas.microsoft.com/office/2019/extlst" xmlns:r="http://schemas.openxmlformats.org/officeDocument/2006/relationships" xmlns:m="http://schemas.openxmlformats.org/officeDocument/2006/math" xmlns:v="urn:schemas-microsoft-com:vml" xmlns:wp14="http://schemas.microsoft.com/office/word/2010/wordprocessingDrawing" xmlns:wp="http://schemas.openxmlformats.org/drawingml/2006/wordprocessingDrawing" xmlns:w10="urn:schemas-microsoft-com:office:word" xmlns:w="http://schemas.openxmlformats.org/wordprocessingml/2006/main" xmlns:w14="http://schemas.microsoft.com/office/word/2010/wordml" xmlns:w15="http://schemas.microsoft.com/office/word/2012/wordml" xmlns:w16cex="http://schemas.microsoft.com/office/word/2018/wordml/cex" xmlns:w16cid="http://schemas.microsoft.com/office/word/2016/wordml/cid" xmlns:w16="http://schemas.microsoft.com/office/word/2018/wordml" xmlns:w16du="http://schemas.microsoft.com/office/word/2023/wordml/word16du" xmlns:w16sdtdh="http://schemas.microsoft.com/office/word/2020/wordml/sdtdatahash" xmlns:w16sdtfl="http://schemas.microsoft.com/office/word/2024/wordml/sdtformatlock" xmlns:w16se="http://schemas.microsoft.com/office/word/2015/wordml/symex" xmlns:wpg="http://schemas.microsoft.com/office/word/2010/wordprocessingGroup" xmlns:wpi="http://schemas.microsoft.com/office/word/2010/wordprocessingInk" xmlns:wne="http://schemas.microsoft.com/office/word/2006/wordml" xmlns:wps="http://schemas.microsoft.com/office/word/2010/wordprocessingShape" mc:Ignorable="w14 w15 w16se w16cid w16 w16cex w16sdtdh w16sdtfl w16du wp14">
+<w:document xmlns:wpc="http://schemas.microsoft.com/office/word/2010/wordprocessingCanvas" xmlns:cx="http://schemas.microsoft.com/office/drawing/2014/chartex" xmlns:cx1="http://schemas.microsoft.com/office/drawing/2015/9/8/chartex" xmlns:cx2="http://schemas.microsoft.com/office/drawing/2015/10/21/chartex" xmlns:cx3="http://schemas.microsoft.com/office/drawing/2016/5/9/chartex" xmlns:cx4="http://schemas.microsoft.com/office/drawing/2016/5/10/chartex" xmlns:cx5="http://schemas.microsoft.com/office/drawing/2016/5/11/chartex" xmlns:cx6="http://schemas.microsoft.com/office/drawing/2016/5/12/chartex" xmlns:cx7="http://schemas.microsoft.com/office/drawing/2016/5/13/chartex" xmlns:cx8="http://schemas.microsoft.com/office/drawing/2016/5/14/chartex" xmlns:mc="http://schemas.openxmlformats.org/markup-compatibility/2006" xmlns:aink="http://schemas.microsoft.com/office/drawing/2016/ink" xmlns:am3d="http://schemas.microsoft.com/office/drawing/2017/model3d" xmlns:o="urn:schemas-microsoft-com:office:office" xmlns:oel="http://schemas.microsoft.com/office/2019/extlst" xmlns:r="http://schemas.openxmlformats.org/officeDocument/2006/relationships" xmlns:m="http://schemas.openxmlformats.org/officeDocument/2006/math" xmlns:v="urn:schemas-microsoft-com:vml" xmlns:wp14="http://schemas.microsoft.com/office/word/2010/wordprocessingDrawing" xmlns:wp="http://schemas.openxmlformats.org/drawingml/2006/wordprocessingDrawing" xmlns:w10="urn:schemas-microsoft-com:office:word" xmlns:w="http://schemas.openxmlformats.org/wordprocessingml/2006/main" xmlns:w14="http://schemas.microsoft.com/office/word/2010/wordml" xmlns:w15="http://schemas.microsoft.com/office/word/2012/wordml" xmlns:w16cei="http://schemas.microsoft.com/office/word/2026/wordml/cei" xmlns:w16cex="http://schemas.microsoft.com/office/word/2018/wordml/cex" xmlns:w16cid="http://schemas.microsoft.com/office/word/2016/wordml/cid" xmlns:w16="http://schemas.microsoft.com/office/word/2018/wordml" xmlns:w16du="http://schemas.microsoft.com/office/word/2023/wordml/word16du" xmlns:w16sdtdh="http://schemas.microsoft.com/office/word/2020/wordml/sdtdatahash" xmlns:w16sdtfl="http://schemas.microsoft.com/office/word/2024/wordml/sdtformatlock" xmlns:w16se="http://schemas.microsoft.com/office/word/2015/wordml/symex" xmlns:wpg="http://schemas.microsoft.com/office/word/2010/wordprocessingGroup" xmlns:wpi="http://schemas.microsoft.com/office/word/2010/wordprocessingInk" xmlns:wne="http://schemas.microsoft.com/office/word/2006/wordml" xmlns:wps="http://schemas.microsoft.com/office/word/2010/wordprocessingShape" mc:Ignorable="w14 w15 w16se w16cid w16 w16cex w16sdtdh w16sdtfl w16du wp14">
   <w:body>
-    <w:p>
-      <w:pPr>
-        <w:spacing w:before="600" w:after="200"/>
-        <w:jc w:val="center"/>
-      </w:pPr>
-      <w:r>
-        <w:rPr>
-          <w:rFonts w:ascii="Arial" w:eastAsia="Arial" w:hAnsi="Arial" w:cs="Arial"/>
-          <w:b/>
-          <w:bCs/>
-          <w:sz w:val="28"/>
-          <w:szCs w:val="28"/>
-          <w:lang w:val="id-ID"/>
-        </w:rPr>
-        <w:t>PEMERINTAH KABUPATEN CIANJUR</w:t>
-      </w:r>
-    </w:p>
-    <w:p>
-      <w:pPr>
-        <w:spacing w:after="80"/>
-        <w:jc w:val="center"/>
-      </w:pPr>
-      <w:r>
-        <w:rPr>
-          <w:rFonts w:ascii="Arial" w:eastAsia="Arial" w:hAnsi="Arial" w:cs="Arial"/>
-          <w:b/>
-          <w:bCs/>
-          <w:sz w:val="24"/>
-          <w:szCs w:val="24"/>
-          <w:lang w:val="id-ID"/>
-        </w:rPr>
-        <w:t>DINAS PERUMAHAN DAN KAWASAN PERMUKIMAN</w:t>
-      </w:r>
-    </w:p>
-    <w:p>
-      <w:pPr>
-        <w:spacing w:after="400"/>
-        <w:jc w:val="center"/>
-      </w:pPr>
-      <w:r>
-        <w:rPr>
-          <w:rFonts w:ascii="Arial" w:eastAsia="Arial" w:hAnsi="Arial" w:cs="Arial"/>
-          <w:b/>
-          <w:bCs/>
-          <w:sz w:val="22"/>
-          <w:szCs w:val="22"/>
-          <w:lang w:val="id-ID"/>
-        </w:rPr>
-        <w:t>BIDANG AIR MINUM DAN SANITASI</w:t>
-      </w:r>
-    </w:p>
-    <w:p>
-      <w:pPr>
-        <w:pBdr>
-          <w:bottom w:val="single" w:sz="12" w:space="8" w:color="1B4F72"/>
-        </w:pBdr>
-        <w:spacing w:before="400" w:after="200"/>
-        <w:jc w:val="center"/>
-      </w:pPr>
-      <w:r>
-        <w:rPr>
-          <w:rFonts w:ascii="Arial" w:eastAsia="Arial" w:hAnsi="Arial" w:cs="Arial"/>
-          <w:b/>
-          <w:bCs/>
-          <w:sz w:val="32"/>
-          <w:szCs w:val="32"/>
-          <w:lang w:val="id-ID"/>
-        </w:rPr>
-        <w:t>MONITORING DAN EVALUASI</w:t>
-      </w:r>
-    </w:p>
     <w:p>
       <w:pPr>
         <w:spacing w:after="120"/>
@@ -144,12 +73,6 @@
         <w:gridCol w:w="5988"/>
       </w:tblGrid>
       <w:tr>
-        <w:tblPrEx>
-          <w:tblCellMar>
-            <w:top w:w="0" w:type="dxa"/>
-            <w:bottom w:w="0" w:type="dxa"/>
-          </w:tblCellMar>
-        </w:tblPrEx>
         <w:tc>
           <w:tcPr>
             <w:tcW w:w="2800" w:type="dxa"/>
@@ -212,12 +135,6 @@
         </w:tc>
       </w:tr>
       <w:tr>
-        <w:tblPrEx>
-          <w:tblCellMar>
-            <w:top w:w="0" w:type="dxa"/>
-            <w:bottom w:w="0" w:type="dxa"/>
-          </w:tblCellMar>
-        </w:tblPrEx>
         <w:tc>
           <w:tcPr>
             <w:tcW w:w="2800" w:type="dxa"/>
@@ -276,12 +193,6 @@
         </w:tc>
       </w:tr>
       <w:tr>
-        <w:tblPrEx>
-          <w:tblCellMar>
-            <w:top w:w="0" w:type="dxa"/>
-            <w:bottom w:w="0" w:type="dxa"/>
-          </w:tblCellMar>
-        </w:tblPrEx>
         <w:tc>
           <w:tcPr>
             <w:tcW w:w="2800" w:type="dxa"/>
@@ -340,12 +251,6 @@
         </w:tc>
       </w:tr>
       <w:tr>
-        <w:tblPrEx>
-          <w:tblCellMar>
-            <w:top w:w="0" w:type="dxa"/>
-            <w:bottom w:w="0" w:type="dxa"/>
-          </w:tblCellMar>
-        </w:tblPrEx>
         <w:tc>
           <w:tcPr>
             <w:tcW w:w="2800" w:type="dxa"/>
@@ -404,12 +309,6 @@
         </w:tc>
       </w:tr>
       <w:tr>
-        <w:tblPrEx>
-          <w:tblCellMar>
-            <w:top w:w="0" w:type="dxa"/>
-            <w:bottom w:w="0" w:type="dxa"/>
-          </w:tblCellMar>
-        </w:tblPrEx>
         <w:tc>
           <w:tcPr>
             <w:tcW w:w="2800" w:type="dxa"/>
@@ -468,12 +367,6 @@
         </w:tc>
       </w:tr>
       <w:tr>
-        <w:tblPrEx>
-          <w:tblCellMar>
-            <w:top w:w="0" w:type="dxa"/>
-            <w:bottom w:w="0" w:type="dxa"/>
-          </w:tblCellMar>
-        </w:tblPrEx>
         <w:tc>
           <w:tcPr>
             <w:tcW w:w="2800" w:type="dxa"/>
@@ -532,12 +425,6 @@
         </w:tc>
       </w:tr>
       <w:tr>
-        <w:tblPrEx>
-          <w:tblCellMar>
-            <w:top w:w="0" w:type="dxa"/>
-            <w:bottom w:w="0" w:type="dxa"/>
-          </w:tblCellMar>
-        </w:tblPrEx>
         <w:tc>
           <w:tcPr>
             <w:tcW w:w="2800" w:type="dxa"/>
@@ -596,12 +483,6 @@
         </w:tc>
       </w:tr>
       <w:tr>
-        <w:tblPrEx>
-          <w:tblCellMar>
-            <w:top w:w="0" w:type="dxa"/>
-            <w:bottom w:w="0" w:type="dxa"/>
-          </w:tblCellMar>
-        </w:tblPrEx>
         <w:tc>
           <w:tcPr>
             <w:tcW w:w="2800" w:type="dxa"/>
@@ -719,7 +600,6 @@
           <w:szCs w:val="22"/>
           <w:lang w:val="id-ID"/>
         </w:rPr>
-        <w:lastRenderedPageBreak/>
         <w:t>Sebelum digitalisasi, progres fisik–keuangan dan dokumentasi lapangan tersebar di Excel, PDF, WhatsApp, dan berkas fisik. Rekapitulasi capaian SPM lintas desa memakan waktu lama, sehingga keputusan pimpinan sering bertumpu pada data yang sudah usang. Arumanis dibangun untuk menyatukan rantai data tersebut dalam satu platform operasional Bidang Air Minum dan Sanitasi.</w:t>
       </w:r>
     </w:p>
@@ -735,16 +615,7 @@
           <w:szCs w:val="22"/>
           <w:lang w:val="id-ID"/>
         </w:rPr>
-        <w:t>M</w:t>
-      </w:r>
-      <w:r>
-        <w:rPr>
-          <w:rFonts w:ascii="Arial" w:eastAsia="Arial" w:hAnsi="Arial" w:cs="Arial"/>
-          <w:sz w:val="22"/>
-          <w:szCs w:val="22"/>
-          <w:lang w:val="id-ID"/>
-        </w:rPr>
-        <w:t>onitoring dan evaluasi (monev) diperlukan agar klaim efisiensi dan efektivitas tidak bersifat anekdotal, melainkan dapat diuji dengan indikator, sumber data, dan rumus yang transparan—termasuk batasan metodologis (misalnya cakupan audit log).</w:t>
+        <w:t>Monitoring dan evaluasi (monev) diperlukan agar klaim efisiensi dan efektivitas tidak bersifat anekdotal, melainkan dapat diuji dengan indikator, sumber data, dan rumus yang transparan—termasuk batasan metodologis (misalnya cakupan audit log).</w:t>
       </w:r>
     </w:p>
     <w:p>
@@ -753,6 +624,7 @@
         <w:spacing w:before="320" w:after="160" w:line="360" w:lineRule="auto"/>
       </w:pPr>
       <w:r>
+        <w:lastRenderedPageBreak/>
         <w:t>1.2 Tujuan</w:t>
       </w:r>
     </w:p>
@@ -857,16 +729,7 @@
           <w:szCs w:val="22"/>
           <w:lang w:val="id-ID"/>
         </w:rPr>
-        <w:t>Ruang lingkup</w:t>
-      </w:r>
-      <w:r>
-        <w:rPr>
-          <w:rFonts w:ascii="Arial" w:eastAsia="Arial" w:hAnsi="Arial" w:cs="Arial"/>
-          <w:sz w:val="22"/>
-          <w:szCs w:val="22"/>
-          <w:lang w:val="id-ID"/>
-        </w:rPr>
-        <w:t xml:space="preserve"> mencakup modul operasional Arumanis: kegiatan–kontrak–pekerjaan, unit SPAM dan capaian, SPM sanitasi, pengawasan lapangan (foto, progres, KPI), PUSPEN/progress fisik, serta publikasi peta capaian. Di luar lingkup: evaluasi dampak kesehatan masyarakat (misalnya penurunan stunting) dan audit keuangan formal atas kontrak—meski data anggaran digunakan sebagai konteks volume program.</w:t>
+        <w:t>Ruang lingkup mencakup modul operasional Arumanis: kegiatan–kontrak–pekerjaan, unit SPAM dan capaian, SPM sanitasi, pengawasan lapangan (foto, progres, KPI), PUSPEN/progress fisik, serta publikasi peta capaian. Di luar lingkup: evaluasi dampak kesehatan masyarakat (misalnya penurunan stunting) dan audit keuangan formal atas kontrak—meski data anggaran digunakan sebagai konteks volume program.</w:t>
       </w:r>
     </w:p>
     <w:p>
@@ -896,23 +759,8 @@
           <w:szCs w:val="22"/>
           <w:lang w:val="id-ID"/>
         </w:rPr>
-        <w:t>Dasar hukum</w:t>
+        <w:t>Dasar hukum merujuk pada kerangka urusan pemerintahan daerah (UU No. 23 Tahun 2014), pengelolaan sumber daya air dan SPAM, SPM bidang kesehatan (Permenkes No. 2 Tahun 2023), SPBE, keterbukaan informasi publik, serta dokumen perencanaan daerah (RPJMD 2025–2029, RISPAM, RAD PAMSIMAS) dan tugas–fungsi DPKP Kabupaten Cianjur.</w:t>
       </w:r>
-      <w:r>
-        <w:rPr>
-          <w:rFonts w:ascii="Arial" w:eastAsia="Arial" w:hAnsi="Arial" w:cs="Arial"/>
-          <w:sz w:val="22"/>
-          <w:szCs w:val="22"/>
-          <w:lang w:val="id-ID"/>
-        </w:rPr>
-        <w:t xml:space="preserve"> merujuk pada kerangka urusan pemerintahan daerah (UU No. 23 Tahun 2014), pengelolaan sumber daya air dan SPAM, SPM bidang kesehatan (Permenkes No. 2 Tahun 2023), SPBE, keterbukaan informasi publik, serta dokumen perencanaan daerah (RPJMD 2025–2029, RISPAM, RAD PAMSIMAS) dan tugas–fungsi DPKP Kabupaten Cianjur.</w:t>
-      </w:r>
-    </w:p>
-    <w:p>
-      <w:pPr>
-        <w:spacing w:after="160" w:line="360" w:lineRule="auto"/>
-        <w:jc w:val="both"/>
-      </w:pPr>
     </w:p>
     <w:p>
       <w:pPr>
@@ -920,8 +768,7 @@
         <w:spacing w:before="400" w:after="200" w:line="360" w:lineRule="auto"/>
       </w:pPr>
       <w:r>
-        <w:lastRenderedPageBreak/>
-        <w:t>2. Kerangka Konseptual Monev</w:t>
+        <w:t xml:space="preserve">2. Kerangka </w:t>
       </w:r>
     </w:p>
     <w:p>
@@ -937,6 +784,12 @@
       <w:pPr>
         <w:spacing w:after="160" w:line="360" w:lineRule="auto"/>
         <w:jc w:val="both"/>
+        <w:rPr>
+          <w:rFonts w:ascii="Arial" w:eastAsia="Arial" w:hAnsi="Arial" w:cs="Arial"/>
+          <w:sz w:val="22"/>
+          <w:szCs w:val="22"/>
+          <w:lang w:val="id-ID"/>
+        </w:rPr>
       </w:pPr>
       <w:r>
         <w:rPr>
@@ -947,6 +800,24 @@
         </w:rPr>
         <w:t>Monev Arumanis memakai rantai hasil sederhana agar membedakan produk sistem (output) dari perubahan perilaku/proses (outcome) dan dampak layanan jangka panjang (impact).</w:t>
       </w:r>
+    </w:p>
+    <w:p>
+      <w:pPr>
+        <w:spacing w:after="160" w:line="360" w:lineRule="auto"/>
+        <w:jc w:val="both"/>
+        <w:rPr>
+          <w:rFonts w:ascii="Arial" w:eastAsia="Arial" w:hAnsi="Arial" w:cs="Arial"/>
+          <w:sz w:val="22"/>
+          <w:szCs w:val="22"/>
+          <w:lang w:val="id-ID"/>
+        </w:rPr>
+      </w:pPr>
+    </w:p>
+    <w:p>
+      <w:pPr>
+        <w:spacing w:after="160" w:line="360" w:lineRule="auto"/>
+        <w:jc w:val="both"/>
+      </w:pPr>
     </w:p>
     <w:tbl>
       <w:tblPr>
@@ -971,12 +842,6 @@
         <w:gridCol w:w="3588"/>
       </w:tblGrid>
       <w:tr>
-        <w:tblPrEx>
-          <w:tblCellMar>
-            <w:top w:w="0" w:type="dxa"/>
-            <w:bottom w:w="0" w:type="dxa"/>
-          </w:tblCellMar>
-        </w:tblPrEx>
         <w:tc>
           <w:tcPr>
             <w:tcW w:w="1600" w:type="dxa"/>
@@ -1003,6 +868,7 @@
                 <w:color w:val="FFFFFF"/>
                 <w:lang w:val="id-ID"/>
               </w:rPr>
+              <w:lastRenderedPageBreak/>
               <w:t>Tingkat</w:t>
             </w:r>
           </w:p>
@@ -1069,12 +935,6 @@
         </w:tc>
       </w:tr>
       <w:tr>
-        <w:tblPrEx>
-          <w:tblCellMar>
-            <w:top w:w="0" w:type="dxa"/>
-            <w:bottom w:w="0" w:type="dxa"/>
-          </w:tblCellMar>
-        </w:tblPrEx>
         <w:tc>
           <w:tcPr>
             <w:tcW w:w="1600" w:type="dxa"/>
@@ -1161,12 +1021,6 @@
         </w:tc>
       </w:tr>
       <w:tr>
-        <w:tblPrEx>
-          <w:tblCellMar>
-            <w:top w:w="0" w:type="dxa"/>
-            <w:bottom w:w="0" w:type="dxa"/>
-          </w:tblCellMar>
-        </w:tblPrEx>
         <w:tc>
           <w:tcPr>
             <w:tcW w:w="1600" w:type="dxa"/>
@@ -1253,12 +1107,6 @@
         </w:tc>
       </w:tr>
       <w:tr>
-        <w:tblPrEx>
-          <w:tblCellMar>
-            <w:top w:w="0" w:type="dxa"/>
-            <w:bottom w:w="0" w:type="dxa"/>
-          </w:tblCellMar>
-        </w:tblPrEx>
         <w:tc>
           <w:tcPr>
             <w:tcW w:w="1600" w:type="dxa"/>
@@ -1345,12 +1193,6 @@
         </w:tc>
       </w:tr>
       <w:tr>
-        <w:tblPrEx>
-          <w:tblCellMar>
-            <w:top w:w="0" w:type="dxa"/>
-            <w:bottom w:w="0" w:type="dxa"/>
-          </w:tblCellMar>
-        </w:tblPrEx>
         <w:tc>
           <w:tcPr>
             <w:tcW w:w="1600" w:type="dxa"/>
@@ -1437,12 +1279,6 @@
         </w:tc>
       </w:tr>
       <w:tr>
-        <w:tblPrEx>
-          <w:tblCellMar>
-            <w:top w:w="0" w:type="dxa"/>
-            <w:bottom w:w="0" w:type="dxa"/>
-          </w:tblCellMar>
-        </w:tblPrEx>
         <w:tc>
           <w:tcPr>
             <w:tcW w:w="1600" w:type="dxa"/>
@@ -1591,12 +1427,6 @@
         <w:gridCol w:w="2588"/>
       </w:tblGrid>
       <w:tr>
-        <w:tblPrEx>
-          <w:tblCellMar>
-            <w:top w:w="0" w:type="dxa"/>
-            <w:bottom w:w="0" w:type="dxa"/>
-          </w:tblCellMar>
-        </w:tblPrEx>
         <w:tc>
           <w:tcPr>
             <w:tcW w:w="1800" w:type="dxa"/>
@@ -1719,12 +1549,6 @@
         </w:tc>
       </w:tr>
       <w:tr>
-        <w:tblPrEx>
-          <w:tblCellMar>
-            <w:top w:w="0" w:type="dxa"/>
-            <w:bottom w:w="0" w:type="dxa"/>
-          </w:tblCellMar>
-        </w:tblPrEx>
         <w:tc>
           <w:tcPr>
             <w:tcW w:w="1800" w:type="dxa"/>
@@ -1839,12 +1663,6 @@
         </w:tc>
       </w:tr>
       <w:tr>
-        <w:tblPrEx>
-          <w:tblCellMar>
-            <w:top w:w="0" w:type="dxa"/>
-            <w:bottom w:w="0" w:type="dxa"/>
-          </w:tblCellMar>
-        </w:tblPrEx>
         <w:tc>
           <w:tcPr>
             <w:tcW w:w="1800" w:type="dxa"/>
@@ -1959,12 +1777,6 @@
         </w:tc>
       </w:tr>
       <w:tr>
-        <w:tblPrEx>
-          <w:tblCellMar>
-            <w:top w:w="0" w:type="dxa"/>
-            <w:bottom w:w="0" w:type="dxa"/>
-          </w:tblCellMar>
-        </w:tblPrEx>
         <w:tc>
           <w:tcPr>
             <w:tcW w:w="1800" w:type="dxa"/>
@@ -2099,7 +1911,6 @@
         <w:spacing w:before="400" w:after="200" w:line="360" w:lineRule="auto"/>
       </w:pPr>
       <w:r>
-        <w:lastRenderedPageBreak/>
         <w:t>3. Metodologi</w:t>
       </w:r>
     </w:p>
@@ -2124,7 +1935,17 @@
           <w:szCs w:val="22"/>
           <w:lang w:val="id-ID"/>
         </w:rPr>
-        <w:t>Desain bersifat deskriptif-analitis dengan pendekatan mixed evidence: (a) data administratif live dari API produksi Arumanis; (b) jejak audit log; (c) snapshot modul progress fisik dan KPI pengawas; (d) baseline “sebelum” berupa rekonstruksi proses manual Bidang AMS pra-penerapan—karena audit log sistem baru aktif sejak akhir Desember 2025 dan tidak merekam praktik 2023–awal 2024.</w:t>
+        <w:t xml:space="preserve">Desain bersifat deskriptif-analitis dengan pendekatan mixed evidence: (a) data administratif live dari API produksi Arumanis; (b) jejak audit log; (c) snapshot modul progress fisik dan KPI pengawas; (d) baseline “sebelum” berupa rekonstruksi proses manual Bidang AMS </w:t>
+      </w:r>
+      <w:r>
+        <w:rPr>
+          <w:rFonts w:ascii="Arial" w:eastAsia="Arial" w:hAnsi="Arial" w:cs="Arial"/>
+          <w:sz w:val="22"/>
+          <w:szCs w:val="22"/>
+          <w:lang w:val="id-ID"/>
+        </w:rPr>
+        <w:lastRenderedPageBreak/>
+        <w:t>pra-penerapan—karena audit log sistem baru aktif sejak akhir Desember 2025 dan tidak merekam praktik 2023–awal 2024.</w:t>
       </w:r>
     </w:p>
     <w:p>
@@ -2159,12 +1980,6 @@
         <w:gridCol w:w="3588"/>
       </w:tblGrid>
       <w:tr>
-        <w:tblPrEx>
-          <w:tblCellMar>
-            <w:top w:w="0" w:type="dxa"/>
-            <w:bottom w:w="0" w:type="dxa"/>
-          </w:tblCellMar>
-        </w:tblPrEx>
         <w:tc>
           <w:tcPr>
             <w:tcW w:w="2000" w:type="dxa"/>
@@ -2257,12 +2072,6 @@
         </w:tc>
       </w:tr>
       <w:tr>
-        <w:tblPrEx>
-          <w:tblCellMar>
-            <w:top w:w="0" w:type="dxa"/>
-            <w:bottom w:w="0" w:type="dxa"/>
-          </w:tblCellMar>
-        </w:tblPrEx>
         <w:tc>
           <w:tcPr>
             <w:tcW w:w="2000" w:type="dxa"/>
@@ -2349,12 +2158,6 @@
         </w:tc>
       </w:tr>
       <w:tr>
-        <w:tblPrEx>
-          <w:tblCellMar>
-            <w:top w:w="0" w:type="dxa"/>
-            <w:bottom w:w="0" w:type="dxa"/>
-          </w:tblCellMar>
-        </w:tblPrEx>
         <w:tc>
           <w:tcPr>
             <w:tcW w:w="2000" w:type="dxa"/>
@@ -2441,12 +2244,6 @@
         </w:tc>
       </w:tr>
       <w:tr>
-        <w:tblPrEx>
-          <w:tblCellMar>
-            <w:top w:w="0" w:type="dxa"/>
-            <w:bottom w:w="0" w:type="dxa"/>
-          </w:tblCellMar>
-        </w:tblPrEx>
         <w:tc>
           <w:tcPr>
             <w:tcW w:w="2000" w:type="dxa"/>
@@ -2533,12 +2330,6 @@
         </w:tc>
       </w:tr>
       <w:tr>
-        <w:tblPrEx>
-          <w:tblCellMar>
-            <w:top w:w="0" w:type="dxa"/>
-            <w:bottom w:w="0" w:type="dxa"/>
-          </w:tblCellMar>
-        </w:tblPrEx>
         <w:tc>
           <w:tcPr>
             <w:tcW w:w="2000" w:type="dxa"/>
@@ -2625,12 +2416,6 @@
         </w:tc>
       </w:tr>
       <w:tr>
-        <w:tblPrEx>
-          <w:tblCellMar>
-            <w:top w:w="0" w:type="dxa"/>
-            <w:bottom w:w="0" w:type="dxa"/>
-          </w:tblCellMar>
-        </w:tblPrEx>
         <w:tc>
           <w:tcPr>
             <w:tcW w:w="2000" w:type="dxa"/>
@@ -2717,12 +2502,6 @@
         </w:tc>
       </w:tr>
       <w:tr>
-        <w:tblPrEx>
-          <w:tblCellMar>
-            <w:top w:w="0" w:type="dxa"/>
-            <w:bottom w:w="0" w:type="dxa"/>
-          </w:tblCellMar>
-        </w:tblPrEx>
         <w:tc>
           <w:tcPr>
             <w:tcW w:w="2000" w:type="dxa"/>
@@ -2809,12 +2588,6 @@
         </w:tc>
       </w:tr>
       <w:tr>
-        <w:tblPrEx>
-          <w:tblCellMar>
-            <w:top w:w="0" w:type="dxa"/>
-            <w:bottom w:w="0" w:type="dxa"/>
-          </w:tblCellMar>
-        </w:tblPrEx>
         <w:tc>
           <w:tcPr>
             <w:tcW w:w="2000" w:type="dxa"/>
@@ -2901,12 +2674,6 @@
         </w:tc>
       </w:tr>
       <w:tr>
-        <w:tblPrEx>
-          <w:tblCellMar>
-            <w:top w:w="0" w:type="dxa"/>
-            <w:bottom w:w="0" w:type="dxa"/>
-          </w:tblCellMar>
-        </w:tblPrEx>
         <w:tc>
           <w:tcPr>
             <w:tcW w:w="2000" w:type="dxa"/>
@@ -3072,12 +2839,6 @@
         <w:gridCol w:w="2188"/>
       </w:tblGrid>
       <w:tr>
-        <w:tblPrEx>
-          <w:tblCellMar>
-            <w:top w:w="0" w:type="dxa"/>
-            <w:bottom w:w="0" w:type="dxa"/>
-          </w:tblCellMar>
-        </w:tblPrEx>
         <w:tc>
           <w:tcPr>
             <w:tcW w:w="2000" w:type="dxa"/>
@@ -3200,12 +2961,6 @@
         </w:tc>
       </w:tr>
       <w:tr>
-        <w:tblPrEx>
-          <w:tblCellMar>
-            <w:top w:w="0" w:type="dxa"/>
-            <w:bottom w:w="0" w:type="dxa"/>
-          </w:tblCellMar>
-        </w:tblPrEx>
         <w:tc>
           <w:tcPr>
             <w:tcW w:w="2000" w:type="dxa"/>
@@ -3320,12 +3075,6 @@
         </w:tc>
       </w:tr>
       <w:tr>
-        <w:tblPrEx>
-          <w:tblCellMar>
-            <w:top w:w="0" w:type="dxa"/>
-            <w:bottom w:w="0" w:type="dxa"/>
-          </w:tblCellMar>
-        </w:tblPrEx>
         <w:tc>
           <w:tcPr>
             <w:tcW w:w="2000" w:type="dxa"/>
@@ -3440,12 +3189,6 @@
         </w:tc>
       </w:tr>
       <w:tr>
-        <w:tblPrEx>
-          <w:tblCellMar>
-            <w:top w:w="0" w:type="dxa"/>
-            <w:bottom w:w="0" w:type="dxa"/>
-          </w:tblCellMar>
-        </w:tblPrEx>
         <w:tc>
           <w:tcPr>
             <w:tcW w:w="2000" w:type="dxa"/>
@@ -3560,12 +3303,6 @@
         </w:tc>
       </w:tr>
       <w:tr>
-        <w:tblPrEx>
-          <w:tblCellMar>
-            <w:top w:w="0" w:type="dxa"/>
-            <w:bottom w:w="0" w:type="dxa"/>
-          </w:tblCellMar>
-        </w:tblPrEx>
         <w:tc>
           <w:tcPr>
             <w:tcW w:w="2000" w:type="dxa"/>
@@ -3590,7 +3327,6 @@
                 <w:color w:val="1A1A1A"/>
                 <w:lang w:val="id-ID"/>
               </w:rPr>
-              <w:lastRenderedPageBreak/>
               <w:t>Kelengkapan foto pengawas KPI</w:t>
             </w:r>
           </w:p>
@@ -3754,6 +3490,7 @@
           <w:szCs w:val="22"/>
           <w:lang w:val="id-ID"/>
         </w:rPr>
+        <w:lastRenderedPageBreak/>
         <w:t>Database Sanitasi (sandb) — https://github.com/ilhamtaufiq/sandb — aktif Okt–Des 2022 (67 commit): silo manajemen paket/realisasi/foto sanitasi.</w:t>
       </w:r>
     </w:p>
@@ -3816,12 +3553,6 @@
         <w:gridCol w:w="2988"/>
       </w:tblGrid>
       <w:tr>
-        <w:tblPrEx>
-          <w:tblCellMar>
-            <w:top w:w="0" w:type="dxa"/>
-            <w:bottom w:w="0" w:type="dxa"/>
-          </w:tblCellMar>
-        </w:tblPrEx>
         <w:tc>
           <w:tcPr>
             <w:tcW w:w="2600" w:type="dxa"/>
@@ -3944,12 +3675,6 @@
         </w:tc>
       </w:tr>
       <w:tr>
-        <w:tblPrEx>
-          <w:tblCellMar>
-            <w:top w:w="0" w:type="dxa"/>
-            <w:bottom w:w="0" w:type="dxa"/>
-          </w:tblCellMar>
-        </w:tblPrEx>
         <w:tc>
           <w:tcPr>
             <w:tcW w:w="2600" w:type="dxa"/>
@@ -4064,12 +3789,6 @@
         </w:tc>
       </w:tr>
       <w:tr>
-        <w:tblPrEx>
-          <w:tblCellMar>
-            <w:top w:w="0" w:type="dxa"/>
-            <w:bottom w:w="0" w:type="dxa"/>
-          </w:tblCellMar>
-        </w:tblPrEx>
         <w:tc>
           <w:tcPr>
             <w:tcW w:w="2600" w:type="dxa"/>
@@ -4184,12 +3903,6 @@
         </w:tc>
       </w:tr>
       <w:tr>
-        <w:tblPrEx>
-          <w:tblCellMar>
-            <w:top w:w="0" w:type="dxa"/>
-            <w:bottom w:w="0" w:type="dxa"/>
-          </w:tblCellMar>
-        </w:tblPrEx>
         <w:tc>
           <w:tcPr>
             <w:tcW w:w="2600" w:type="dxa"/>
@@ -4304,12 +4017,6 @@
         </w:tc>
       </w:tr>
       <w:tr>
-        <w:tblPrEx>
-          <w:tblCellMar>
-            <w:top w:w="0" w:type="dxa"/>
-            <w:bottom w:w="0" w:type="dxa"/>
-          </w:tblCellMar>
-        </w:tblPrEx>
         <w:tc>
           <w:tcPr>
             <w:tcW w:w="2600" w:type="dxa"/>
@@ -4424,12 +4131,6 @@
         </w:tc>
       </w:tr>
       <w:tr>
-        <w:tblPrEx>
-          <w:tblCellMar>
-            <w:top w:w="0" w:type="dxa"/>
-            <w:bottom w:w="0" w:type="dxa"/>
-          </w:tblCellMar>
-        </w:tblPrEx>
         <w:tc>
           <w:tcPr>
             <w:tcW w:w="2600" w:type="dxa"/>
@@ -4544,12 +4245,6 @@
         </w:tc>
       </w:tr>
       <w:tr>
-        <w:tblPrEx>
-          <w:tblCellMar>
-            <w:top w:w="0" w:type="dxa"/>
-            <w:bottom w:w="0" w:type="dxa"/>
-          </w:tblCellMar>
-        </w:tblPrEx>
         <w:tc>
           <w:tcPr>
             <w:tcW w:w="2600" w:type="dxa"/>
@@ -4664,12 +4359,6 @@
         </w:tc>
       </w:tr>
       <w:tr>
-        <w:tblPrEx>
-          <w:tblCellMar>
-            <w:top w:w="0" w:type="dxa"/>
-            <w:bottom w:w="0" w:type="dxa"/>
-          </w:tblCellMar>
-        </w:tblPrEx>
         <w:tc>
           <w:tcPr>
             <w:tcW w:w="2600" w:type="dxa"/>
@@ -4784,12 +4473,6 @@
         </w:tc>
       </w:tr>
       <w:tr>
-        <w:tblPrEx>
-          <w:tblCellMar>
-            <w:top w:w="0" w:type="dxa"/>
-            <w:bottom w:w="0" w:type="dxa"/>
-          </w:tblCellMar>
-        </w:tblPrEx>
         <w:tc>
           <w:tcPr>
             <w:tcW w:w="2600" w:type="dxa"/>
@@ -4904,12 +4587,6 @@
         </w:tc>
       </w:tr>
       <w:tr>
-        <w:tblPrEx>
-          <w:tblCellMar>
-            <w:top w:w="0" w:type="dxa"/>
-            <w:bottom w:w="0" w:type="dxa"/>
-          </w:tblCellMar>
-        </w:tblPrEx>
         <w:tc>
           <w:tcPr>
             <w:tcW w:w="2600" w:type="dxa"/>
@@ -5046,49 +4723,10 @@
     </w:p>
     <w:p>
       <w:pPr>
-        <w:spacing w:before="80" w:after="200"/>
-        <w:rPr>
-          <w:rFonts w:ascii="Arial" w:eastAsia="Arial" w:hAnsi="Arial" w:cs="Arial"/>
-          <w:i/>
-          <w:iCs/>
-          <w:lang w:val="id-ID"/>
-        </w:rPr>
-      </w:pPr>
-    </w:p>
-    <w:p>
-      <w:pPr>
-        <w:spacing w:before="80" w:after="200"/>
-        <w:rPr>
-          <w:rFonts w:ascii="Arial" w:eastAsia="Arial" w:hAnsi="Arial" w:cs="Arial"/>
-          <w:i/>
-          <w:iCs/>
-          <w:lang w:val="id-ID"/>
-        </w:rPr>
-      </w:pPr>
-    </w:p>
-    <w:p>
-      <w:pPr>
-        <w:spacing w:before="80" w:after="200"/>
-        <w:rPr>
-          <w:rFonts w:ascii="Arial" w:eastAsia="Arial" w:hAnsi="Arial" w:cs="Arial"/>
-          <w:i/>
-          <w:iCs/>
-          <w:lang w:val="id-ID"/>
-        </w:rPr>
-      </w:pPr>
-    </w:p>
-    <w:p>
-      <w:pPr>
-        <w:spacing w:before="80" w:after="200"/>
-      </w:pPr>
-    </w:p>
-    <w:p>
-      <w:pPr>
         <w:pStyle w:val="Heading2"/>
         <w:spacing w:before="320" w:after="160" w:line="360" w:lineRule="auto"/>
       </w:pPr>
       <w:r>
-        <w:lastRenderedPageBreak/>
         <w:t>3.5 Batasan Metodologis</w:t>
       </w:r>
     </w:p>
@@ -5189,6 +4827,7 @@
           <w:szCs w:val="22"/>
           <w:lang w:val="id-ID"/>
         </w:rPr>
+        <w:lastRenderedPageBreak/>
         <w:t>Cakupan SPM yang masih rendah tidak dibaca sebagai kegagalan aplikasi semata, melainkan sebagai indikator kebutuhan investasi fisik multi-tahun yang dibantu prioritisasi data.</w:t>
       </w:r>
     </w:p>
@@ -5233,12 +4872,6 @@
         <w:gridCol w:w="4188"/>
       </w:tblGrid>
       <w:tr>
-        <w:tblPrEx>
-          <w:tblCellMar>
-            <w:top w:w="0" w:type="dxa"/>
-            <w:bottom w:w="0" w:type="dxa"/>
-          </w:tblCellMar>
-        </w:tblPrEx>
         <w:tc>
           <w:tcPr>
             <w:tcW w:w="2200" w:type="dxa"/>
@@ -5331,12 +4964,6 @@
         </w:tc>
       </w:tr>
       <w:tr>
-        <w:tblPrEx>
-          <w:tblCellMar>
-            <w:top w:w="0" w:type="dxa"/>
-            <w:bottom w:w="0" w:type="dxa"/>
-          </w:tblCellMar>
-        </w:tblPrEx>
         <w:tc>
           <w:tcPr>
             <w:tcW w:w="2200" w:type="dxa"/>
@@ -5423,12 +5050,6 @@
         </w:tc>
       </w:tr>
       <w:tr>
-        <w:tblPrEx>
-          <w:tblCellMar>
-            <w:top w:w="0" w:type="dxa"/>
-            <w:bottom w:w="0" w:type="dxa"/>
-          </w:tblCellMar>
-        </w:tblPrEx>
         <w:tc>
           <w:tcPr>
             <w:tcW w:w="2200" w:type="dxa"/>
@@ -5515,12 +5136,6 @@
         </w:tc>
       </w:tr>
       <w:tr>
-        <w:tblPrEx>
-          <w:tblCellMar>
-            <w:top w:w="0" w:type="dxa"/>
-            <w:bottom w:w="0" w:type="dxa"/>
-          </w:tblCellMar>
-        </w:tblPrEx>
         <w:tc>
           <w:tcPr>
             <w:tcW w:w="2200" w:type="dxa"/>
@@ -5607,12 +5222,6 @@
         </w:tc>
       </w:tr>
       <w:tr>
-        <w:tblPrEx>
-          <w:tblCellMar>
-            <w:top w:w="0" w:type="dxa"/>
-            <w:bottom w:w="0" w:type="dxa"/>
-          </w:tblCellMar>
-        </w:tblPrEx>
         <w:tc>
           <w:tcPr>
             <w:tcW w:w="2200" w:type="dxa"/>
@@ -5699,12 +5308,6 @@
         </w:tc>
       </w:tr>
       <w:tr>
-        <w:tblPrEx>
-          <w:tblCellMar>
-            <w:top w:w="0" w:type="dxa"/>
-            <w:bottom w:w="0" w:type="dxa"/>
-          </w:tblCellMar>
-        </w:tblPrEx>
         <w:tc>
           <w:tcPr>
             <w:tcW w:w="2200" w:type="dxa"/>
@@ -5836,12 +5439,6 @@
         <w:gridCol w:w="5988"/>
       </w:tblGrid>
       <w:tr>
-        <w:tblPrEx>
-          <w:tblCellMar>
-            <w:top w:w="0" w:type="dxa"/>
-            <w:bottom w:w="0" w:type="dxa"/>
-          </w:tblCellMar>
-        </w:tblPrEx>
         <w:tc>
           <w:tcPr>
             <w:tcW w:w="2800" w:type="dxa"/>
@@ -5904,12 +5501,6 @@
         </w:tc>
       </w:tr>
       <w:tr>
-        <w:tblPrEx>
-          <w:tblCellMar>
-            <w:top w:w="0" w:type="dxa"/>
-            <w:bottom w:w="0" w:type="dxa"/>
-          </w:tblCellMar>
-        </w:tblPrEx>
         <w:tc>
           <w:tcPr>
             <w:tcW w:w="2800" w:type="dxa"/>
@@ -5968,12 +5559,6 @@
         </w:tc>
       </w:tr>
       <w:tr>
-        <w:tblPrEx>
-          <w:tblCellMar>
-            <w:top w:w="0" w:type="dxa"/>
-            <w:bottom w:w="0" w:type="dxa"/>
-          </w:tblCellMar>
-        </w:tblPrEx>
         <w:tc>
           <w:tcPr>
             <w:tcW w:w="2800" w:type="dxa"/>
@@ -6032,12 +5617,6 @@
         </w:tc>
       </w:tr>
       <w:tr>
-        <w:tblPrEx>
-          <w:tblCellMar>
-            <w:top w:w="0" w:type="dxa"/>
-            <w:bottom w:w="0" w:type="dxa"/>
-          </w:tblCellMar>
-        </w:tblPrEx>
         <w:tc>
           <w:tcPr>
             <w:tcW w:w="2800" w:type="dxa"/>
@@ -6096,12 +5675,6 @@
         </w:tc>
       </w:tr>
       <w:tr>
-        <w:tblPrEx>
-          <w:tblCellMar>
-            <w:top w:w="0" w:type="dxa"/>
-            <w:bottom w:w="0" w:type="dxa"/>
-          </w:tblCellMar>
-        </w:tblPrEx>
         <w:tc>
           <w:tcPr>
             <w:tcW w:w="2800" w:type="dxa"/>
@@ -6160,12 +5733,6 @@
         </w:tc>
       </w:tr>
       <w:tr>
-        <w:tblPrEx>
-          <w:tblCellMar>
-            <w:top w:w="0" w:type="dxa"/>
-            <w:bottom w:w="0" w:type="dxa"/>
-          </w:tblCellMar>
-        </w:tblPrEx>
         <w:tc>
           <w:tcPr>
             <w:tcW w:w="2800" w:type="dxa"/>
@@ -6244,7 +5811,6 @@
         <w:spacing w:before="320" w:after="160" w:line="360" w:lineRule="auto"/>
       </w:pPr>
       <w:r>
-        <w:lastRenderedPageBreak/>
         <w:t>4.3 Volume Operasional (Snapshot)</w:t>
       </w:r>
     </w:p>
@@ -6270,12 +5836,6 @@
         <w:gridCol w:w="4388"/>
       </w:tblGrid>
       <w:tr>
-        <w:tblPrEx>
-          <w:tblCellMar>
-            <w:top w:w="0" w:type="dxa"/>
-            <w:bottom w:w="0" w:type="dxa"/>
-          </w:tblCellMar>
-        </w:tblPrEx>
         <w:tc>
           <w:tcPr>
             <w:tcW w:w="4400" w:type="dxa"/>
@@ -6338,12 +5898,6 @@
         </w:tc>
       </w:tr>
       <w:tr>
-        <w:tblPrEx>
-          <w:tblCellMar>
-            <w:top w:w="0" w:type="dxa"/>
-            <w:bottom w:w="0" w:type="dxa"/>
-          </w:tblCellMar>
-        </w:tblPrEx>
         <w:tc>
           <w:tcPr>
             <w:tcW w:w="4400" w:type="dxa"/>
@@ -6402,12 +5956,6 @@
         </w:tc>
       </w:tr>
       <w:tr>
-        <w:tblPrEx>
-          <w:tblCellMar>
-            <w:top w:w="0" w:type="dxa"/>
-            <w:bottom w:w="0" w:type="dxa"/>
-          </w:tblCellMar>
-        </w:tblPrEx>
         <w:tc>
           <w:tcPr>
             <w:tcW w:w="4400" w:type="dxa"/>
@@ -6466,12 +6014,6 @@
         </w:tc>
       </w:tr>
       <w:tr>
-        <w:tblPrEx>
-          <w:tblCellMar>
-            <w:top w:w="0" w:type="dxa"/>
-            <w:bottom w:w="0" w:type="dxa"/>
-          </w:tblCellMar>
-        </w:tblPrEx>
         <w:tc>
           <w:tcPr>
             <w:tcW w:w="4400" w:type="dxa"/>
@@ -6530,12 +6072,6 @@
         </w:tc>
       </w:tr>
       <w:tr>
-        <w:tblPrEx>
-          <w:tblCellMar>
-            <w:top w:w="0" w:type="dxa"/>
-            <w:bottom w:w="0" w:type="dxa"/>
-          </w:tblCellMar>
-        </w:tblPrEx>
         <w:tc>
           <w:tcPr>
             <w:tcW w:w="4400" w:type="dxa"/>
@@ -6594,12 +6130,6 @@
         </w:tc>
       </w:tr>
       <w:tr>
-        <w:tblPrEx>
-          <w:tblCellMar>
-            <w:top w:w="0" w:type="dxa"/>
-            <w:bottom w:w="0" w:type="dxa"/>
-          </w:tblCellMar>
-        </w:tblPrEx>
         <w:tc>
           <w:tcPr>
             <w:tcW w:w="4400" w:type="dxa"/>
@@ -6658,12 +6188,6 @@
         </w:tc>
       </w:tr>
       <w:tr>
-        <w:tblPrEx>
-          <w:tblCellMar>
-            <w:top w:w="0" w:type="dxa"/>
-            <w:bottom w:w="0" w:type="dxa"/>
-          </w:tblCellMar>
-        </w:tblPrEx>
         <w:tc>
           <w:tcPr>
             <w:tcW w:w="4400" w:type="dxa"/>
@@ -6722,12 +6246,6 @@
         </w:tc>
       </w:tr>
       <w:tr>
-        <w:tblPrEx>
-          <w:tblCellMar>
-            <w:top w:w="0" w:type="dxa"/>
-            <w:bottom w:w="0" w:type="dxa"/>
-          </w:tblCellMar>
-        </w:tblPrEx>
         <w:tc>
           <w:tcPr>
             <w:tcW w:w="4400" w:type="dxa"/>
@@ -6786,12 +6304,6 @@
         </w:tc>
       </w:tr>
       <w:tr>
-        <w:tblPrEx>
-          <w:tblCellMar>
-            <w:top w:w="0" w:type="dxa"/>
-            <w:bottom w:w="0" w:type="dxa"/>
-          </w:tblCellMar>
-        </w:tblPrEx>
         <w:tc>
           <w:tcPr>
             <w:tcW w:w="4400" w:type="dxa"/>
@@ -6850,12 +6362,6 @@
         </w:tc>
       </w:tr>
       <w:tr>
-        <w:tblPrEx>
-          <w:tblCellMar>
-            <w:top w:w="0" w:type="dxa"/>
-            <w:bottom w:w="0" w:type="dxa"/>
-          </w:tblCellMar>
-        </w:tblPrEx>
         <w:tc>
           <w:tcPr>
             <w:tcW w:w="4400" w:type="dxa"/>
@@ -6880,6 +6386,7 @@
                 <w:color w:val="1A1A1A"/>
                 <w:lang w:val="id-ID"/>
               </w:rPr>
+              <w:lastRenderedPageBreak/>
               <w:t>Capaian SPM sanitasi (KK)</w:t>
             </w:r>
           </w:p>
@@ -6914,12 +6421,6 @@
         </w:tc>
       </w:tr>
       <w:tr>
-        <w:tblPrEx>
-          <w:tblCellMar>
-            <w:top w:w="0" w:type="dxa"/>
-            <w:bottom w:w="0" w:type="dxa"/>
-          </w:tblCellMar>
-        </w:tblPrEx>
         <w:tc>
           <w:tcPr>
             <w:tcW w:w="4400" w:type="dxa"/>
@@ -7074,12 +6575,6 @@
         <w:gridCol w:w="1588"/>
       </w:tblGrid>
       <w:tr>
-        <w:tblPrEx>
-          <w:tblCellMar>
-            <w:top w:w="0" w:type="dxa"/>
-            <w:bottom w:w="0" w:type="dxa"/>
-          </w:tblCellMar>
-        </w:tblPrEx>
         <w:tc>
           <w:tcPr>
             <w:tcW w:w="1200" w:type="dxa"/>
@@ -7232,12 +6727,6 @@
         </w:tc>
       </w:tr>
       <w:tr>
-        <w:tblPrEx>
-          <w:tblCellMar>
-            <w:top w:w="0" w:type="dxa"/>
-            <w:bottom w:w="0" w:type="dxa"/>
-          </w:tblCellMar>
-        </w:tblPrEx>
         <w:tc>
           <w:tcPr>
             <w:tcW w:w="1200" w:type="dxa"/>
@@ -7380,12 +6869,6 @@
         </w:tc>
       </w:tr>
       <w:tr>
-        <w:tblPrEx>
-          <w:tblCellMar>
-            <w:top w:w="0" w:type="dxa"/>
-            <w:bottom w:w="0" w:type="dxa"/>
-          </w:tblCellMar>
-        </w:tblPrEx>
         <w:tc>
           <w:tcPr>
             <w:tcW w:w="1200" w:type="dxa"/>
@@ -7528,12 +7011,6 @@
         </w:tc>
       </w:tr>
       <w:tr>
-        <w:tblPrEx>
-          <w:tblCellMar>
-            <w:top w:w="0" w:type="dxa"/>
-            <w:bottom w:w="0" w:type="dxa"/>
-          </w:tblCellMar>
-        </w:tblPrEx>
         <w:tc>
           <w:tcPr>
             <w:tcW w:w="1200" w:type="dxa"/>
@@ -7676,12 +7153,6 @@
         </w:tc>
       </w:tr>
       <w:tr>
-        <w:tblPrEx>
-          <w:tblCellMar>
-            <w:top w:w="0" w:type="dxa"/>
-            <w:bottom w:w="0" w:type="dxa"/>
-          </w:tblCellMar>
-        </w:tblPrEx>
         <w:tc>
           <w:tcPr>
             <w:tcW w:w="1200" w:type="dxa"/>
@@ -7824,12 +7295,6 @@
         </w:tc>
       </w:tr>
       <w:tr>
-        <w:tblPrEx>
-          <w:tblCellMar>
-            <w:top w:w="0" w:type="dxa"/>
-            <w:bottom w:w="0" w:type="dxa"/>
-          </w:tblCellMar>
-        </w:tblPrEx>
         <w:tc>
           <w:tcPr>
             <w:tcW w:w="1200" w:type="dxa"/>
@@ -7992,7 +7457,6 @@
         <w:spacing w:before="320" w:after="160" w:line="360" w:lineRule="auto"/>
       </w:pPr>
       <w:r>
-        <w:lastRenderedPageBreak/>
         <w:t>5.3 Progress Fisik Paket</w:t>
       </w:r>
     </w:p>
@@ -8000,6 +7464,12 @@
       <w:pPr>
         <w:spacing w:after="160" w:line="360" w:lineRule="auto"/>
         <w:jc w:val="both"/>
+        <w:rPr>
+          <w:rFonts w:ascii="Arial" w:eastAsia="Arial" w:hAnsi="Arial" w:cs="Arial"/>
+          <w:sz w:val="22"/>
+          <w:szCs w:val="22"/>
+          <w:lang w:val="id-ID"/>
+        </w:rPr>
       </w:pPr>
       <w:r>
         <w:rPr>
@@ -8013,10 +7483,41 @@
     </w:p>
     <w:p>
       <w:pPr>
+        <w:spacing w:after="160" w:line="360" w:lineRule="auto"/>
+        <w:jc w:val="both"/>
+        <w:rPr>
+          <w:rFonts w:ascii="Arial" w:eastAsia="Arial" w:hAnsi="Arial" w:cs="Arial"/>
+          <w:sz w:val="22"/>
+          <w:szCs w:val="22"/>
+          <w:lang w:val="id-ID"/>
+        </w:rPr>
+      </w:pPr>
+    </w:p>
+    <w:p>
+      <w:pPr>
+        <w:spacing w:after="160" w:line="360" w:lineRule="auto"/>
+        <w:jc w:val="both"/>
+        <w:rPr>
+          <w:rFonts w:ascii="Arial" w:eastAsia="Arial" w:hAnsi="Arial" w:cs="Arial"/>
+          <w:sz w:val="22"/>
+          <w:szCs w:val="22"/>
+          <w:lang w:val="id-ID"/>
+        </w:rPr>
+      </w:pPr>
+    </w:p>
+    <w:p>
+      <w:pPr>
+        <w:spacing w:after="160" w:line="360" w:lineRule="auto"/>
+        <w:jc w:val="both"/>
+      </w:pPr>
+    </w:p>
+    <w:p>
+      <w:pPr>
         <w:pStyle w:val="Heading2"/>
         <w:spacing w:before="320" w:after="160" w:line="360" w:lineRule="auto"/>
       </w:pPr>
       <w:r>
+        <w:lastRenderedPageBreak/>
         <w:t>5.4 Keterbukaan Informasi</w:t>
       </w:r>
     </w:p>
@@ -8130,17 +7631,10 @@
     </w:p>
     <w:p>
       <w:pPr>
-        <w:spacing w:after="160" w:line="360" w:lineRule="auto"/>
-        <w:jc w:val="both"/>
-      </w:pPr>
-    </w:p>
-    <w:p>
-      <w:pPr>
         <w:pStyle w:val="Heading2"/>
         <w:spacing w:before="320" w:after="160" w:line="360" w:lineRule="auto"/>
       </w:pPr>
       <w:r>
-        <w:lastRenderedPageBreak/>
         <w:t>6.3 Ringkasan Skor Efisiensi</w:t>
       </w:r>
     </w:p>
@@ -8169,12 +7663,6 @@
         <w:gridCol w:w="2088"/>
       </w:tblGrid>
       <w:tr>
-        <w:tblPrEx>
-          <w:tblCellMar>
-            <w:top w:w="0" w:type="dxa"/>
-            <w:bottom w:w="0" w:type="dxa"/>
-          </w:tblCellMar>
-        </w:tblPrEx>
         <w:tc>
           <w:tcPr>
             <w:tcW w:w="2200" w:type="dxa"/>
@@ -8327,12 +7815,6 @@
         </w:tc>
       </w:tr>
       <w:tr>
-        <w:tblPrEx>
-          <w:tblCellMar>
-            <w:top w:w="0" w:type="dxa"/>
-            <w:bottom w:w="0" w:type="dxa"/>
-          </w:tblCellMar>
-        </w:tblPrEx>
         <w:tc>
           <w:tcPr>
             <w:tcW w:w="2200" w:type="dxa"/>
@@ -8475,12 +7957,6 @@
         </w:tc>
       </w:tr>
       <w:tr>
-        <w:tblPrEx>
-          <w:tblCellMar>
-            <w:top w:w="0" w:type="dxa"/>
-            <w:bottom w:w="0" w:type="dxa"/>
-          </w:tblCellMar>
-        </w:tblPrEx>
         <w:tc>
           <w:tcPr>
             <w:tcW w:w="2200" w:type="dxa"/>
@@ -8623,12 +8099,6 @@
         </w:tc>
       </w:tr>
       <w:tr>
-        <w:tblPrEx>
-          <w:tblCellMar>
-            <w:top w:w="0" w:type="dxa"/>
-            <w:bottom w:w="0" w:type="dxa"/>
-          </w:tblCellMar>
-        </w:tblPrEx>
         <w:tc>
           <w:tcPr>
             <w:tcW w:w="2200" w:type="dxa"/>
@@ -8771,12 +8241,6 @@
         </w:tc>
       </w:tr>
       <w:tr>
-        <w:tblPrEx>
-          <w:tblCellMar>
-            <w:top w:w="0" w:type="dxa"/>
-            <w:bottom w:w="0" w:type="dxa"/>
-          </w:tblCellMar>
-        </w:tblPrEx>
         <w:tc>
           <w:tcPr>
             <w:tcW w:w="2200" w:type="dxa"/>
@@ -8930,6 +8394,7 @@
           <w:iCs/>
           <w:lang w:val="id-ID"/>
         </w:rPr>
+        <w:lastRenderedPageBreak/>
         <w:t>Tabel 10. Ringkasan evaluasi efisiensi</w:t>
       </w:r>
     </w:p>
@@ -8966,12 +8431,6 @@
         <w:gridCol w:w="2188"/>
       </w:tblGrid>
       <w:tr>
-        <w:tblPrEx>
-          <w:tblCellMar>
-            <w:top w:w="0" w:type="dxa"/>
-            <w:bottom w:w="0" w:type="dxa"/>
-          </w:tblCellMar>
-        </w:tblPrEx>
         <w:tc>
           <w:tcPr>
             <w:tcW w:w="2000" w:type="dxa"/>
@@ -9094,12 +8553,6 @@
         </w:tc>
       </w:tr>
       <w:tr>
-        <w:tblPrEx>
-          <w:tblCellMar>
-            <w:top w:w="0" w:type="dxa"/>
-            <w:bottom w:w="0" w:type="dxa"/>
-          </w:tblCellMar>
-        </w:tblPrEx>
         <w:tc>
           <w:tcPr>
             <w:tcW w:w="2000" w:type="dxa"/>
@@ -9214,12 +8667,6 @@
         </w:tc>
       </w:tr>
       <w:tr>
-        <w:tblPrEx>
-          <w:tblCellMar>
-            <w:top w:w="0" w:type="dxa"/>
-            <w:bottom w:w="0" w:type="dxa"/>
-          </w:tblCellMar>
-        </w:tblPrEx>
         <w:tc>
           <w:tcPr>
             <w:tcW w:w="2000" w:type="dxa"/>
@@ -9334,12 +8781,6 @@
         </w:tc>
       </w:tr>
       <w:tr>
-        <w:tblPrEx>
-          <w:tblCellMar>
-            <w:top w:w="0" w:type="dxa"/>
-            <w:bottom w:w="0" w:type="dxa"/>
-          </w:tblCellMar>
-        </w:tblPrEx>
         <w:tc>
           <w:tcPr>
             <w:tcW w:w="2000" w:type="dxa"/>
@@ -9454,12 +8895,6 @@
         </w:tc>
       </w:tr>
       <w:tr>
-        <w:tblPrEx>
-          <w:tblCellMar>
-            <w:top w:w="0" w:type="dxa"/>
-            <w:bottom w:w="0" w:type="dxa"/>
-          </w:tblCellMar>
-        </w:tblPrEx>
         <w:tc>
           <w:tcPr>
             <w:tcW w:w="2000" w:type="dxa"/>
@@ -9574,12 +9009,6 @@
         </w:tc>
       </w:tr>
       <w:tr>
-        <w:tblPrEx>
-          <w:tblCellMar>
-            <w:top w:w="0" w:type="dxa"/>
-            <w:bottom w:w="0" w:type="dxa"/>
-          </w:tblCellMar>
-        </w:tblPrEx>
         <w:tc>
           <w:tcPr>
             <w:tcW w:w="2000" w:type="dxa"/>
@@ -9694,12 +9123,6 @@
         </w:tc>
       </w:tr>
       <w:tr>
-        <w:tblPrEx>
-          <w:tblCellMar>
-            <w:top w:w="0" w:type="dxa"/>
-            <w:bottom w:w="0" w:type="dxa"/>
-          </w:tblCellMar>
-        </w:tblPrEx>
         <w:tc>
           <w:tcPr>
             <w:tcW w:w="2000" w:type="dxa"/>
@@ -9914,9 +9337,26 @@
           <w:szCs w:val="22"/>
           <w:lang w:val="id-ID"/>
         </w:rPr>
-        <w:lastRenderedPageBreak/>
         <w:t>Baseline manual belum diformalisasi dalam berita acara pengukuran waktu 2023; disarankan pengesahan internal agar angka rekonstruksi memiliki legitimasi administratif.</w:t>
       </w:r>
+    </w:p>
+    <w:p>
+      <w:pPr>
+        <w:spacing w:after="100" w:line="360" w:lineRule="auto"/>
+        <w:jc w:val="both"/>
+      </w:pPr>
+    </w:p>
+    <w:p>
+      <w:pPr>
+        <w:spacing w:after="100" w:line="360" w:lineRule="auto"/>
+        <w:jc w:val="both"/>
+      </w:pPr>
+    </w:p>
+    <w:p>
+      <w:pPr>
+        <w:spacing w:after="100" w:line="360" w:lineRule="auto"/>
+        <w:jc w:val="both"/>
+      </w:pPr>
     </w:p>
     <w:p>
       <w:pPr>
@@ -9924,6 +9364,7 @@
         <w:spacing w:before="400" w:after="200" w:line="360" w:lineRule="auto"/>
       </w:pPr>
       <w:r>
+        <w:lastRenderedPageBreak/>
         <w:t>8. Risiko dan Mitigasi</w:t>
       </w:r>
     </w:p>
@@ -9950,12 +9391,6 @@
         <w:gridCol w:w="3988"/>
       </w:tblGrid>
       <w:tr>
-        <w:tblPrEx>
-          <w:tblCellMar>
-            <w:top w:w="0" w:type="dxa"/>
-            <w:bottom w:w="0" w:type="dxa"/>
-          </w:tblCellMar>
-        </w:tblPrEx>
         <w:tc>
           <w:tcPr>
             <w:tcW w:w="2400" w:type="dxa"/>
@@ -10048,12 +9483,6 @@
         </w:tc>
       </w:tr>
       <w:tr>
-        <w:tblPrEx>
-          <w:tblCellMar>
-            <w:top w:w="0" w:type="dxa"/>
-            <w:bottom w:w="0" w:type="dxa"/>
-          </w:tblCellMar>
-        </w:tblPrEx>
         <w:tc>
           <w:tcPr>
             <w:tcW w:w="2400" w:type="dxa"/>
@@ -10140,12 +9569,6 @@
         </w:tc>
       </w:tr>
       <w:tr>
-        <w:tblPrEx>
-          <w:tblCellMar>
-            <w:top w:w="0" w:type="dxa"/>
-            <w:bottom w:w="0" w:type="dxa"/>
-          </w:tblCellMar>
-        </w:tblPrEx>
         <w:tc>
           <w:tcPr>
             <w:tcW w:w="2400" w:type="dxa"/>
@@ -10232,12 +9655,6 @@
         </w:tc>
       </w:tr>
       <w:tr>
-        <w:tblPrEx>
-          <w:tblCellMar>
-            <w:top w:w="0" w:type="dxa"/>
-            <w:bottom w:w="0" w:type="dxa"/>
-          </w:tblCellMar>
-        </w:tblPrEx>
         <w:tc>
           <w:tcPr>
             <w:tcW w:w="2400" w:type="dxa"/>
@@ -10324,12 +9741,6 @@
         </w:tc>
       </w:tr>
       <w:tr>
-        <w:tblPrEx>
-          <w:tblCellMar>
-            <w:top w:w="0" w:type="dxa"/>
-            <w:bottom w:w="0" w:type="dxa"/>
-          </w:tblCellMar>
-        </w:tblPrEx>
         <w:tc>
           <w:tcPr>
             <w:tcW w:w="2400" w:type="dxa"/>
@@ -10416,12 +9827,6 @@
         </w:tc>
       </w:tr>
       <w:tr>
-        <w:tblPrEx>
-          <w:tblCellMar>
-            <w:top w:w="0" w:type="dxa"/>
-            <w:bottom w:w="0" w:type="dxa"/>
-          </w:tblCellMar>
-        </w:tblPrEx>
         <w:tc>
           <w:tcPr>
             <w:tcW w:w="2400" w:type="dxa"/>
@@ -10642,23 +10047,10 @@
     </w:p>
     <w:p>
       <w:pPr>
-        <w:spacing w:after="100" w:line="360" w:lineRule="auto"/>
-        <w:jc w:val="both"/>
-      </w:pPr>
-    </w:p>
-    <w:p>
-      <w:pPr>
-        <w:spacing w:after="100" w:line="360" w:lineRule="auto"/>
-        <w:jc w:val="both"/>
-      </w:pPr>
-    </w:p>
-    <w:p>
-      <w:pPr>
         <w:pStyle w:val="Heading2"/>
         <w:spacing w:before="320" w:after="160" w:line="360" w:lineRule="auto"/>
       </w:pPr>
       <w:r>
-        <w:lastRenderedPageBreak/>
         <w:t>9.2 Rekomendasi 2027–2028</w:t>
       </w:r>
     </w:p>
@@ -10708,6 +10100,7 @@
         <w:spacing w:before="320" w:after="160" w:line="360" w:lineRule="auto"/>
       </w:pPr>
       <w:r>
+        <w:lastRenderedPageBreak/>
         <w:t>9.3 Indikator Kinerja Monev Berkelanjutan</w:t>
       </w:r>
     </w:p>
@@ -10735,12 +10128,6 @@
         <w:gridCol w:w="2188"/>
       </w:tblGrid>
       <w:tr>
-        <w:tblPrEx>
-          <w:tblCellMar>
-            <w:top w:w="0" w:type="dxa"/>
-            <w:bottom w:w="0" w:type="dxa"/>
-          </w:tblCellMar>
-        </w:tblPrEx>
         <w:tc>
           <w:tcPr>
             <w:tcW w:w="2600" w:type="dxa"/>
@@ -10863,12 +10250,6 @@
         </w:tc>
       </w:tr>
       <w:tr>
-        <w:tblPrEx>
-          <w:tblCellMar>
-            <w:top w:w="0" w:type="dxa"/>
-            <w:bottom w:w="0" w:type="dxa"/>
-          </w:tblCellMar>
-        </w:tblPrEx>
         <w:tc>
           <w:tcPr>
             <w:tcW w:w="2600" w:type="dxa"/>
@@ -10983,12 +10364,6 @@
         </w:tc>
       </w:tr>
       <w:tr>
-        <w:tblPrEx>
-          <w:tblCellMar>
-            <w:top w:w="0" w:type="dxa"/>
-            <w:bottom w:w="0" w:type="dxa"/>
-          </w:tblCellMar>
-        </w:tblPrEx>
         <w:tc>
           <w:tcPr>
             <w:tcW w:w="2600" w:type="dxa"/>
@@ -11103,12 +10478,6 @@
         </w:tc>
       </w:tr>
       <w:tr>
-        <w:tblPrEx>
-          <w:tblCellMar>
-            <w:top w:w="0" w:type="dxa"/>
-            <w:bottom w:w="0" w:type="dxa"/>
-          </w:tblCellMar>
-        </w:tblPrEx>
         <w:tc>
           <w:tcPr>
             <w:tcW w:w="2600" w:type="dxa"/>
@@ -11223,12 +10592,6 @@
         </w:tc>
       </w:tr>
       <w:tr>
-        <w:tblPrEx>
-          <w:tblCellMar>
-            <w:top w:w="0" w:type="dxa"/>
-            <w:bottom w:w="0" w:type="dxa"/>
-          </w:tblCellMar>
-        </w:tblPrEx>
         <w:tc>
           <w:tcPr>
             <w:tcW w:w="2600" w:type="dxa"/>
@@ -11343,12 +10706,6 @@
         </w:tc>
       </w:tr>
       <w:tr>
-        <w:tblPrEx>
-          <w:tblCellMar>
-            <w:top w:w="0" w:type="dxa"/>
-            <w:bottom w:w="0" w:type="dxa"/>
-          </w:tblCellMar>
-        </w:tblPrEx>
         <w:tc>
           <w:tcPr>
             <w:tcW w:w="2600" w:type="dxa"/>
@@ -11530,6 +10887,36 @@
     </w:p>
     <w:p>
       <w:pPr>
+        <w:spacing w:after="160" w:line="360" w:lineRule="auto"/>
+        <w:jc w:val="both"/>
+      </w:pPr>
+    </w:p>
+    <w:p>
+      <w:pPr>
+        <w:spacing w:after="160" w:line="360" w:lineRule="auto"/>
+        <w:jc w:val="both"/>
+      </w:pPr>
+    </w:p>
+    <w:p>
+      <w:pPr>
+        <w:spacing w:after="160" w:line="360" w:lineRule="auto"/>
+        <w:jc w:val="both"/>
+      </w:pPr>
+    </w:p>
+    <w:p>
+      <w:pPr>
+        <w:spacing w:after="160" w:line="360" w:lineRule="auto"/>
+        <w:jc w:val="both"/>
+      </w:pPr>
+    </w:p>
+    <w:p>
+      <w:pPr>
+        <w:spacing w:after="160" w:line="360" w:lineRule="auto"/>
+        <w:jc w:val="both"/>
+      </w:pPr>
+    </w:p>
+    <w:p>
+      <w:pPr>
         <w:pStyle w:val="Heading1"/>
         <w:spacing w:before="400" w:after="200" w:line="360" w:lineRule="auto"/>
       </w:pPr>
@@ -11566,12 +10953,6 @@
         <w:gridCol w:w="6588"/>
       </w:tblGrid>
       <w:tr>
-        <w:tblPrEx>
-          <w:tblCellMar>
-            <w:top w:w="0" w:type="dxa"/>
-            <w:bottom w:w="0" w:type="dxa"/>
-          </w:tblCellMar>
-        </w:tblPrEx>
         <w:tc>
           <w:tcPr>
             <w:tcW w:w="2200" w:type="dxa"/>
@@ -11654,12 +11035,6 @@
         </w:tc>
       </w:tr>
       <w:tr>
-        <w:tblPrEx>
-          <w:tblCellMar>
-            <w:top w:w="0" w:type="dxa"/>
-            <w:bottom w:w="0" w:type="dxa"/>
-          </w:tblCellMar>
-        </w:tblPrEx>
         <w:tc>
           <w:tcPr>
             <w:tcW w:w="2200" w:type="dxa"/>
@@ -11718,12 +11093,6 @@
         </w:tc>
       </w:tr>
       <w:tr>
-        <w:tblPrEx>
-          <w:tblCellMar>
-            <w:top w:w="0" w:type="dxa"/>
-            <w:bottom w:w="0" w:type="dxa"/>
-          </w:tblCellMar>
-        </w:tblPrEx>
         <w:tc>
           <w:tcPr>
             <w:tcW w:w="2200" w:type="dxa"/>
@@ -11782,12 +11151,6 @@
         </w:tc>
       </w:tr>
       <w:tr>
-        <w:tblPrEx>
-          <w:tblCellMar>
-            <w:top w:w="0" w:type="dxa"/>
-            <w:bottom w:w="0" w:type="dxa"/>
-          </w:tblCellMar>
-        </w:tblPrEx>
         <w:tc>
           <w:tcPr>
             <w:tcW w:w="2200" w:type="dxa"/>
@@ -11846,12 +11209,6 @@
         </w:tc>
       </w:tr>
       <w:tr>
-        <w:tblPrEx>
-          <w:tblCellMar>
-            <w:top w:w="0" w:type="dxa"/>
-            <w:bottom w:w="0" w:type="dxa"/>
-          </w:tblCellMar>
-        </w:tblPrEx>
         <w:tc>
           <w:tcPr>
             <w:tcW w:w="2200" w:type="dxa"/>
@@ -11910,12 +11267,6 @@
         </w:tc>
       </w:tr>
       <w:tr>
-        <w:tblPrEx>
-          <w:tblCellMar>
-            <w:top w:w="0" w:type="dxa"/>
-            <w:bottom w:w="0" w:type="dxa"/>
-          </w:tblCellMar>
-        </w:tblPrEx>
         <w:tc>
           <w:tcPr>
             <w:tcW w:w="2200" w:type="dxa"/>
@@ -11974,12 +11325,6 @@
         </w:tc>
       </w:tr>
       <w:tr>
-        <w:tblPrEx>
-          <w:tblCellMar>
-            <w:top w:w="0" w:type="dxa"/>
-            <w:bottom w:w="0" w:type="dxa"/>
-          </w:tblCellMar>
-        </w:tblPrEx>
         <w:tc>
           <w:tcPr>
             <w:tcW w:w="2200" w:type="dxa"/>
@@ -12038,12 +11383,6 @@
         </w:tc>
       </w:tr>
       <w:tr>
-        <w:tblPrEx>
-          <w:tblCellMar>
-            <w:top w:w="0" w:type="dxa"/>
-            <w:bottom w:w="0" w:type="dxa"/>
-          </w:tblCellMar>
-        </w:tblPrEx>
         <w:tc>
           <w:tcPr>
             <w:tcW w:w="2200" w:type="dxa"/>
@@ -12126,84 +11465,6 @@
         <w:spacing w:after="160" w:line="360" w:lineRule="auto"/>
         <w:jc w:val="both"/>
       </w:pPr>
-      <w:r>
-        <w:rPr>
-          <w:rFonts w:ascii="Arial" w:eastAsia="Arial" w:hAnsi="Arial" w:cs="Arial"/>
-          <w:sz w:val="22"/>
-          <w:szCs w:val="22"/>
-          <w:lang w:val="id-ID"/>
-        </w:rPr>
-        <w:t>Cianjur, 13 Juli 2026</w:t>
-      </w:r>
-    </w:p>
-    <w:p>
-      <w:pPr>
-        <w:spacing w:after="160" w:line="360" w:lineRule="auto"/>
-        <w:jc w:val="both"/>
-      </w:pPr>
-      <w:r>
-        <w:rPr>
-          <w:rFonts w:ascii="Arial" w:eastAsia="Arial" w:hAnsi="Arial" w:cs="Arial"/>
-          <w:sz w:val="22"/>
-          <w:szCs w:val="22"/>
-          <w:lang w:val="id-ID"/>
-        </w:rPr>
-        <w:t>Bidang Air Minum dan Sanitasi</w:t>
-      </w:r>
-    </w:p>
-    <w:p>
-      <w:pPr>
-        <w:spacing w:after="160" w:line="360" w:lineRule="auto"/>
-        <w:jc w:val="both"/>
-      </w:pPr>
-      <w:r>
-        <w:rPr>
-          <w:rFonts w:ascii="Arial" w:eastAsia="Arial" w:hAnsi="Arial" w:cs="Arial"/>
-          <w:sz w:val="22"/>
-          <w:szCs w:val="22"/>
-          <w:lang w:val="id-ID"/>
-        </w:rPr>
-        <w:t>Dinas Perumahan dan Kawasan Permukiman Kabupaten Cianju</w:t>
-      </w:r>
-      <w:r>
-        <w:rPr>
-          <w:rFonts w:ascii="Arial" w:eastAsia="Arial" w:hAnsi="Arial" w:cs="Arial"/>
-          <w:sz w:val="22"/>
-          <w:szCs w:val="22"/>
-          <w:lang w:val="id-ID"/>
-        </w:rPr>
-        <w:t>r</w:t>
-      </w:r>
-    </w:p>
-    <w:p>
-      <w:pPr>
-        <w:spacing w:after="160" w:line="360" w:lineRule="auto"/>
-        <w:jc w:val="both"/>
-      </w:pPr>
-      <w:r>
-        <w:rPr>
-          <w:rFonts w:ascii="Arial" w:eastAsia="Arial" w:hAnsi="Arial" w:cs="Arial"/>
-          <w:sz w:val="22"/>
-          <w:szCs w:val="22"/>
-          <w:lang w:val="id-ID"/>
-        </w:rPr>
-        <w:t>_________________________</w:t>
-      </w:r>
-    </w:p>
-    <w:p>
-      <w:pPr>
-        <w:spacing w:after="160" w:line="360" w:lineRule="auto"/>
-        <w:jc w:val="both"/>
-      </w:pPr>
-      <w:r>
-        <w:rPr>
-          <w:rFonts w:ascii="Arial" w:eastAsia="Arial" w:hAnsi="Arial" w:cs="Arial"/>
-          <w:sz w:val="22"/>
-          <w:szCs w:val="22"/>
-          <w:lang w:val="id-ID"/>
-        </w:rPr>
-        <w:t>Tim Pengelola Arumanis / Inisiator</w:t>
-      </w:r>
     </w:p>
     <w:sectPr>
       <w:headerReference w:type="default" r:id="rId7"/>
@@ -12218,7 +11479,7 @@
 </file>
 
 <file path=word/endnotes.xml><?xml version="1.0" encoding="utf-8"?>
-<w:endnotes xmlns:wpc="http://schemas.microsoft.com/office/word/2010/wordprocessingCanvas" xmlns:cx="http://schemas.microsoft.com/office/drawing/2014/chartex" xmlns:cx1="http://schemas.microsoft.com/office/drawing/2015/9/8/chartex" xmlns:cx2="http://schemas.microsoft.com/office/drawing/2015/10/21/chartex" xmlns:cx3="http://schemas.microsoft.com/office/drawing/2016/5/9/chartex" xmlns:cx4="http://schemas.microsoft.com/office/drawing/2016/5/10/chartex" xmlns:cx5="http://schemas.microsoft.com/office/drawing/2016/5/11/chartex" xmlns:cx6="http://schemas.microsoft.com/office/drawing/2016/5/12/chartex" xmlns:cx7="http://schemas.microsoft.com/office/drawing/2016/5/13/chartex" xmlns:cx8="http://schemas.microsoft.com/office/drawing/2016/5/14/chartex" xmlns:mc="http://schemas.openxmlformats.org/markup-compatibility/2006" xmlns:aink="http://schemas.microsoft.com/office/drawing/2016/ink" xmlns:am3d="http://schemas.microsoft.com/office/drawing/2017/model3d" xmlns:o="urn:schemas-microsoft-com:office:office" xmlns:oel="http://schemas.microsoft.com/office/2019/extlst" xmlns:r="http://schemas.openxmlformats.org/officeDocument/2006/relationships" xmlns:m="http://schemas.openxmlformats.org/officeDocument/2006/math" xmlns:v="urn:schemas-microsoft-com:vml" xmlns:wp14="http://schemas.microsoft.com/office/word/2010/wordprocessingDrawing" xmlns:wp="http://schemas.openxmlformats.org/drawingml/2006/wordprocessingDrawing" xmlns:w10="urn:schemas-microsoft-com:office:word" xmlns:w="http://schemas.openxmlformats.org/wordprocessingml/2006/main" xmlns:w14="http://schemas.microsoft.com/office/word/2010/wordml" xmlns:w15="http://schemas.microsoft.com/office/word/2012/wordml" xmlns:w16cex="http://schemas.microsoft.com/office/word/2018/wordml/cex" xmlns:w16cid="http://schemas.microsoft.com/office/word/2016/wordml/cid" xmlns:w16="http://schemas.microsoft.com/office/word/2018/wordml" xmlns:w16du="http://schemas.microsoft.com/office/word/2023/wordml/word16du" xmlns:w16sdtdh="http://schemas.microsoft.com/office/word/2020/wordml/sdtdatahash" xmlns:w16sdtfl="http://schemas.microsoft.com/office/word/2024/wordml/sdtformatlock" xmlns:w16se="http://schemas.microsoft.com/office/word/2015/wordml/symex" xmlns:wpg="http://schemas.microsoft.com/office/word/2010/wordprocessingGroup" xmlns:wpi="http://schemas.microsoft.com/office/word/2010/wordprocessingInk" xmlns:wne="http://schemas.microsoft.com/office/word/2006/wordml" xmlns:wps="http://schemas.microsoft.com/office/word/2010/wordprocessingShape" mc:Ignorable="w14 w15 w16se w16cid w16 w16cex w16sdtdh w16sdtfl w16du wp14">
+<w:endnotes xmlns:wpc="http://schemas.microsoft.com/office/word/2010/wordprocessingCanvas" xmlns:cx="http://schemas.microsoft.com/office/drawing/2014/chartex" xmlns:cx1="http://schemas.microsoft.com/office/drawing/2015/9/8/chartex" xmlns:cx2="http://schemas.microsoft.com/office/drawing/2015/10/21/chartex" xmlns:cx3="http://schemas.microsoft.com/office/drawing/2016/5/9/chartex" xmlns:cx4="http://schemas.microsoft.com/office/drawing/2016/5/10/chartex" xmlns:cx5="http://schemas.microsoft.com/office/drawing/2016/5/11/chartex" xmlns:cx6="http://schemas.microsoft.com/office/drawing/2016/5/12/chartex" xmlns:cx7="http://schemas.microsoft.com/office/drawing/2016/5/13/chartex" xmlns:cx8="http://schemas.microsoft.com/office/drawing/2016/5/14/chartex" xmlns:mc="http://schemas.openxmlformats.org/markup-compatibility/2006" xmlns:aink="http://schemas.microsoft.com/office/drawing/2016/ink" xmlns:am3d="http://schemas.microsoft.com/office/drawing/2017/model3d" xmlns:o="urn:schemas-microsoft-com:office:office" xmlns:oel="http://schemas.microsoft.com/office/2019/extlst" xmlns:r="http://schemas.openxmlformats.org/officeDocument/2006/relationships" xmlns:m="http://schemas.openxmlformats.org/officeDocument/2006/math" xmlns:v="urn:schemas-microsoft-com:vml" xmlns:wp14="http://schemas.microsoft.com/office/word/2010/wordprocessingDrawing" xmlns:wp="http://schemas.openxmlformats.org/drawingml/2006/wordprocessingDrawing" xmlns:w10="urn:schemas-microsoft-com:office:word" xmlns:w="http://schemas.openxmlformats.org/wordprocessingml/2006/main" xmlns:w14="http://schemas.microsoft.com/office/word/2010/wordml" xmlns:w15="http://schemas.microsoft.com/office/word/2012/wordml" xmlns:w16cei="http://schemas.microsoft.com/office/word/2026/wordml/cei" xmlns:w16cex="http://schemas.microsoft.com/office/word/2018/wordml/cex" xmlns:w16cid="http://schemas.microsoft.com/office/word/2016/wordml/cid" xmlns:w16="http://schemas.microsoft.com/office/word/2018/wordml" xmlns:w16du="http://schemas.microsoft.com/office/word/2023/wordml/word16du" xmlns:w16sdtdh="http://schemas.microsoft.com/office/word/2020/wordml/sdtdatahash" xmlns:w16sdtfl="http://schemas.microsoft.com/office/word/2024/wordml/sdtformatlock" xmlns:w16se="http://schemas.microsoft.com/office/word/2015/wordml/symex" xmlns:wpg="http://schemas.microsoft.com/office/word/2010/wordprocessingGroup" xmlns:wpi="http://schemas.microsoft.com/office/word/2010/wordprocessingInk" xmlns:wne="http://schemas.microsoft.com/office/word/2006/wordml" xmlns:wps="http://schemas.microsoft.com/office/word/2010/wordprocessingShape" mc:Ignorable="w14 w15 w16se w16cid w16 w16cex w16sdtdh w16sdtfl w16du wp14">
   <w:endnote w:type="separator" w:id="-1">
     <w:p>
       <w:r>
@@ -12237,7 +11498,7 @@
 </file>
 
 <file path=word/footer1.xml><?xml version="1.0" encoding="utf-8"?>
-<w:ftr xmlns:wpc="http://schemas.microsoft.com/office/word/2010/wordprocessingCanvas" xmlns:cx="http://schemas.microsoft.com/office/drawing/2014/chartex" xmlns:cx1="http://schemas.microsoft.com/office/drawing/2015/9/8/chartex" xmlns:cx2="http://schemas.microsoft.com/office/drawing/2015/10/21/chartex" xmlns:cx3="http://schemas.microsoft.com/office/drawing/2016/5/9/chartex" xmlns:cx4="http://schemas.microsoft.com/office/drawing/2016/5/10/chartex" xmlns:cx5="http://schemas.microsoft.com/office/drawing/2016/5/11/chartex" xmlns:cx6="http://schemas.microsoft.com/office/drawing/2016/5/12/chartex" xmlns:cx7="http://schemas.microsoft.com/office/drawing/2016/5/13/chartex" xmlns:cx8="http://schemas.microsoft.com/office/drawing/2016/5/14/chartex" xmlns:mc="http://schemas.openxmlformats.org/markup-compatibility/2006" xmlns:aink="http://schemas.microsoft.com/office/drawing/2016/ink" xmlns:am3d="http://schemas.microsoft.com/office/drawing/2017/model3d" xmlns:o="urn:schemas-microsoft-com:office:office" xmlns:oel="http://schemas.microsoft.com/office/2019/extlst" xmlns:r="http://schemas.openxmlformats.org/officeDocument/2006/relationships" xmlns:m="http://schemas.openxmlformats.org/officeDocument/2006/math" xmlns:v="urn:schemas-microsoft-com:vml" xmlns:wp14="http://schemas.microsoft.com/office/word/2010/wordprocessingDrawing" xmlns:wp="http://schemas.openxmlformats.org/drawingml/2006/wordprocessingDrawing" xmlns:w10="urn:schemas-microsoft-com:office:word" xmlns:w="http://schemas.openxmlformats.org/wordprocessingml/2006/main" xmlns:w14="http://schemas.microsoft.com/office/word/2010/wordml" xmlns:w15="http://schemas.microsoft.com/office/word/2012/wordml" xmlns:w16cex="http://schemas.microsoft.com/office/word/2018/wordml/cex" xmlns:w16cid="http://schemas.microsoft.com/office/word/2016/wordml/cid" xmlns:w16="http://schemas.microsoft.com/office/word/2018/wordml" xmlns:w16du="http://schemas.microsoft.com/office/word/2023/wordml/word16du" xmlns:w16sdtdh="http://schemas.microsoft.com/office/word/2020/wordml/sdtdatahash" xmlns:w16sdtfl="http://schemas.microsoft.com/office/word/2024/wordml/sdtformatlock" xmlns:w16se="http://schemas.microsoft.com/office/word/2015/wordml/symex" xmlns:wpg="http://schemas.microsoft.com/office/word/2010/wordprocessingGroup" xmlns:wpi="http://schemas.microsoft.com/office/word/2010/wordprocessingInk" xmlns:wne="http://schemas.microsoft.com/office/word/2006/wordml" xmlns:wps="http://schemas.microsoft.com/office/word/2010/wordprocessingShape" mc:Ignorable="w14 w15 w16se w16cid w16 w16cex w16sdtdh w16sdtfl w16du wp14">
+<w:ftr xmlns:wpc="http://schemas.microsoft.com/office/word/2010/wordprocessingCanvas" xmlns:cx="http://schemas.microsoft.com/office/drawing/2014/chartex" xmlns:cx1="http://schemas.microsoft.com/office/drawing/2015/9/8/chartex" xmlns:cx2="http://schemas.microsoft.com/office/drawing/2015/10/21/chartex" xmlns:cx3="http://schemas.microsoft.com/office/drawing/2016/5/9/chartex" xmlns:cx4="http://schemas.microsoft.com/office/drawing/2016/5/10/chartex" xmlns:cx5="http://schemas.microsoft.com/office/drawing/2016/5/11/chartex" xmlns:cx6="http://schemas.microsoft.com/office/drawing/2016/5/12/chartex" xmlns:cx7="http://schemas.microsoft.com/office/drawing/2016/5/13/chartex" xmlns:cx8="http://schemas.microsoft.com/office/drawing/2016/5/14/chartex" xmlns:mc="http://schemas.openxmlformats.org/markup-compatibility/2006" xmlns:aink="http://schemas.microsoft.com/office/drawing/2016/ink" xmlns:am3d="http://schemas.microsoft.com/office/drawing/2017/model3d" xmlns:o="urn:schemas-microsoft-com:office:office" xmlns:oel="http://schemas.microsoft.com/office/2019/extlst" xmlns:r="http://schemas.openxmlformats.org/officeDocument/2006/relationships" xmlns:m="http://schemas.openxmlformats.org/officeDocument/2006/math" xmlns:v="urn:schemas-microsoft-com:vml" xmlns:wp14="http://schemas.microsoft.com/office/word/2010/wordprocessingDrawing" xmlns:wp="http://schemas.openxmlformats.org/drawingml/2006/wordprocessingDrawing" xmlns:w10="urn:schemas-microsoft-com:office:word" xmlns:w="http://schemas.openxmlformats.org/wordprocessingml/2006/main" xmlns:w14="http://schemas.microsoft.com/office/word/2010/wordml" xmlns:w15="http://schemas.microsoft.com/office/word/2012/wordml" xmlns:w16cei="http://schemas.microsoft.com/office/word/2026/wordml/cei" xmlns:w16cex="http://schemas.microsoft.com/office/word/2018/wordml/cex" xmlns:w16cid="http://schemas.microsoft.com/office/word/2016/wordml/cid" xmlns:w16="http://schemas.microsoft.com/office/word/2018/wordml" xmlns:w16du="http://schemas.microsoft.com/office/word/2023/wordml/word16du" xmlns:w16sdtdh="http://schemas.microsoft.com/office/word/2020/wordml/sdtdatahash" xmlns:w16sdtfl="http://schemas.microsoft.com/office/word/2024/wordml/sdtformatlock" xmlns:w16se="http://schemas.microsoft.com/office/word/2015/wordml/symex" xmlns:wpg="http://schemas.microsoft.com/office/word/2010/wordprocessingGroup" xmlns:wpi="http://schemas.microsoft.com/office/word/2010/wordprocessingInk" xmlns:wne="http://schemas.microsoft.com/office/word/2006/wordml" xmlns:wps="http://schemas.microsoft.com/office/word/2010/wordprocessingShape" mc:Ignorable="w14 w15 w16se w16cid w16 w16cex w16sdtdh w16sdtfl w16du wp14">
   <w:p>
     <w:pPr>
       <w:jc w:val="center"/>
@@ -12356,7 +11617,7 @@
 </file>
 
 <file path=word/footnotes.xml><?xml version="1.0" encoding="utf-8"?>
-<w:footnotes xmlns:wpc="http://schemas.microsoft.com/office/word/2010/wordprocessingCanvas" xmlns:cx="http://schemas.microsoft.com/office/drawing/2014/chartex" xmlns:cx1="http://schemas.microsoft.com/office/drawing/2015/9/8/chartex" xmlns:cx2="http://schemas.microsoft.com/office/drawing/2015/10/21/chartex" xmlns:cx3="http://schemas.microsoft.com/office/drawing/2016/5/9/chartex" xmlns:cx4="http://schemas.microsoft.com/office/drawing/2016/5/10/chartex" xmlns:cx5="http://schemas.microsoft.com/office/drawing/2016/5/11/chartex" xmlns:cx6="http://schemas.microsoft.com/office/drawing/2016/5/12/chartex" xmlns:cx7="http://schemas.microsoft.com/office/drawing/2016/5/13/chartex" xmlns:cx8="http://schemas.microsoft.com/office/drawing/2016/5/14/chartex" xmlns:mc="http://schemas.openxmlformats.org/markup-compatibility/2006" xmlns:aink="http://schemas.microsoft.com/office/drawing/2016/ink" xmlns:am3d="http://schemas.microsoft.com/office/drawing/2017/model3d" xmlns:o="urn:schemas-microsoft-com:office:office" xmlns:oel="http://schemas.microsoft.com/office/2019/extlst" xmlns:r="http://schemas.openxmlformats.org/officeDocument/2006/relationships" xmlns:m="http://schemas.openxmlformats.org/officeDocument/2006/math" xmlns:v="urn:schemas-microsoft-com:vml" xmlns:wp14="http://schemas.microsoft.com/office/word/2010/wordprocessingDrawing" xmlns:wp="http://schemas.openxmlformats.org/drawingml/2006/wordprocessingDrawing" xmlns:w10="urn:schemas-microsoft-com:office:word" xmlns:w="http://schemas.openxmlformats.org/wordprocessingml/2006/main" xmlns:w14="http://schemas.microsoft.com/office/word/2010/wordml" xmlns:w15="http://schemas.microsoft.com/office/word/2012/wordml" xmlns:w16cex="http://schemas.microsoft.com/office/word/2018/wordml/cex" xmlns:w16cid="http://schemas.microsoft.com/office/word/2016/wordml/cid" xmlns:w16="http://schemas.microsoft.com/office/word/2018/wordml" xmlns:w16du="http://schemas.microsoft.com/office/word/2023/wordml/word16du" xmlns:w16sdtdh="http://schemas.microsoft.com/office/word/2020/wordml/sdtdatahash" xmlns:w16sdtfl="http://schemas.microsoft.com/office/word/2024/wordml/sdtformatlock" xmlns:w16se="http://schemas.microsoft.com/office/word/2015/wordml/symex" xmlns:wpg="http://schemas.microsoft.com/office/word/2010/wordprocessingGroup" xmlns:wpi="http://schemas.microsoft.com/office/word/2010/wordprocessingInk" xmlns:wne="http://schemas.microsoft.com/office/word/2006/wordml" xmlns:wps="http://schemas.microsoft.com/office/word/2010/wordprocessingShape" mc:Ignorable="w14 w15 w16se w16cid w16 w16cex w16sdtdh w16sdtfl w16du wp14">
+<w:footnotes xmlns:wpc="http://schemas.microsoft.com/office/word/2010/wordprocessingCanvas" xmlns:cx="http://schemas.microsoft.com/office/drawing/2014/chartex" xmlns:cx1="http://schemas.microsoft.com/office/drawing/2015/9/8/chartex" xmlns:cx2="http://schemas.microsoft.com/office/drawing/2015/10/21/chartex" xmlns:cx3="http://schemas.microsoft.com/office/drawing/2016/5/9/chartex" xmlns:cx4="http://schemas.microsoft.com/office/drawing/2016/5/10/chartex" xmlns:cx5="http://schemas.microsoft.com/office/drawing/2016/5/11/chartex" xmlns:cx6="http://schemas.microsoft.com/office/drawing/2016/5/12/chartex" xmlns:cx7="http://schemas.microsoft.com/office/drawing/2016/5/13/chartex" xmlns:cx8="http://schemas.microsoft.com/office/drawing/2016/5/14/chartex" xmlns:mc="http://schemas.openxmlformats.org/markup-compatibility/2006" xmlns:aink="http://schemas.microsoft.com/office/drawing/2016/ink" xmlns:am3d="http://schemas.microsoft.com/office/drawing/2017/model3d" xmlns:o="urn:schemas-microsoft-com:office:office" xmlns:oel="http://schemas.microsoft.com/office/2019/extlst" xmlns:r="http://schemas.openxmlformats.org/officeDocument/2006/relationships" xmlns:m="http://schemas.openxmlformats.org/officeDocument/2006/math" xmlns:v="urn:schemas-microsoft-com:vml" xmlns:wp14="http://schemas.microsoft.com/office/word/2010/wordprocessingDrawing" xmlns:wp="http://schemas.openxmlformats.org/drawingml/2006/wordprocessingDrawing" xmlns:w10="urn:schemas-microsoft-com:office:word" xmlns:w="http://schemas.openxmlformats.org/wordprocessingml/2006/main" xmlns:w14="http://schemas.microsoft.com/office/word/2010/wordml" xmlns:w15="http://schemas.microsoft.com/office/word/2012/wordml" xmlns:w16cei="http://schemas.microsoft.com/office/word/2026/wordml/cei" xmlns:w16cex="http://schemas.microsoft.com/office/word/2018/wordml/cex" xmlns:w16cid="http://schemas.microsoft.com/office/word/2016/wordml/cid" xmlns:w16="http://schemas.microsoft.com/office/word/2018/wordml" xmlns:w16du="http://schemas.microsoft.com/office/word/2023/wordml/word16du" xmlns:w16sdtdh="http://schemas.microsoft.com/office/word/2020/wordml/sdtdatahash" xmlns:w16sdtfl="http://schemas.microsoft.com/office/word/2024/wordml/sdtformatlock" xmlns:w16se="http://schemas.microsoft.com/office/word/2015/wordml/symex" xmlns:wpg="http://schemas.microsoft.com/office/word/2010/wordprocessingGroup" xmlns:wpi="http://schemas.microsoft.com/office/word/2010/wordprocessingInk" xmlns:wne="http://schemas.microsoft.com/office/word/2006/wordml" xmlns:wps="http://schemas.microsoft.com/office/word/2010/wordprocessingShape" mc:Ignorable="w14 w15 w16se w16cid w16 w16cex w16sdtdh w16sdtfl w16du wp14">
   <w:footnote w:type="separator" w:id="-1">
     <w:p>
       <w:r>
@@ -12375,7 +11636,7 @@
 </file>
 
 <file path=word/header1.xml><?xml version="1.0" encoding="utf-8"?>
-<w:hdr xmlns:wpc="http://schemas.microsoft.com/office/word/2010/wordprocessingCanvas" xmlns:cx="http://schemas.microsoft.com/office/drawing/2014/chartex" xmlns:cx1="http://schemas.microsoft.com/office/drawing/2015/9/8/chartex" xmlns:cx2="http://schemas.microsoft.com/office/drawing/2015/10/21/chartex" xmlns:cx3="http://schemas.microsoft.com/office/drawing/2016/5/9/chartex" xmlns:cx4="http://schemas.microsoft.com/office/drawing/2016/5/10/chartex" xmlns:cx5="http://schemas.microsoft.com/office/drawing/2016/5/11/chartex" xmlns:cx6="http://schemas.microsoft.com/office/drawing/2016/5/12/chartex" xmlns:cx7="http://schemas.microsoft.com/office/drawing/2016/5/13/chartex" xmlns:cx8="http://schemas.microsoft.com/office/drawing/2016/5/14/chartex" xmlns:mc="http://schemas.openxmlformats.org/markup-compatibility/2006" xmlns:aink="http://schemas.microsoft.com/office/drawing/2016/ink" xmlns:am3d="http://schemas.microsoft.com/office/drawing/2017/model3d" xmlns:o="urn:schemas-microsoft-com:office:office" xmlns:oel="http://schemas.microsoft.com/office/2019/extlst" xmlns:r="http://schemas.openxmlformats.org/officeDocument/2006/relationships" xmlns:m="http://schemas.openxmlformats.org/officeDocument/2006/math" xmlns:v="urn:schemas-microsoft-com:vml" xmlns:wp14="http://schemas.microsoft.com/office/word/2010/wordprocessingDrawing" xmlns:wp="http://schemas.openxmlformats.org/drawingml/2006/wordprocessingDrawing" xmlns:w10="urn:schemas-microsoft-com:office:word" xmlns:w="http://schemas.openxmlformats.org/wordprocessingml/2006/main" xmlns:w14="http://schemas.microsoft.com/office/word/2010/wordml" xmlns:w15="http://schemas.microsoft.com/office/word/2012/wordml" xmlns:w16cex="http://schemas.microsoft.com/office/word/2018/wordml/cex" xmlns:w16cid="http://schemas.microsoft.com/office/word/2016/wordml/cid" xmlns:w16="http://schemas.microsoft.com/office/word/2018/wordml" xmlns:w16du="http://schemas.microsoft.com/office/word/2023/wordml/word16du" xmlns:w16sdtdh="http://schemas.microsoft.com/office/word/2020/wordml/sdtdatahash" xmlns:w16sdtfl="http://schemas.microsoft.com/office/word/2024/wordml/sdtformatlock" xmlns:w16se="http://schemas.microsoft.com/office/word/2015/wordml/symex" xmlns:wpg="http://schemas.microsoft.com/office/word/2010/wordprocessingGroup" xmlns:wpi="http://schemas.microsoft.com/office/word/2010/wordprocessingInk" xmlns:wne="http://schemas.microsoft.com/office/word/2006/wordml" xmlns:wps="http://schemas.microsoft.com/office/word/2010/wordprocessingShape" mc:Ignorable="w14 w15 w16se w16cid w16 w16cex w16sdtdh w16sdtfl w16du wp14">
+<w:hdr xmlns:wpc="http://schemas.microsoft.com/office/word/2010/wordprocessingCanvas" xmlns:cx="http://schemas.microsoft.com/office/drawing/2014/chartex" xmlns:cx1="http://schemas.microsoft.com/office/drawing/2015/9/8/chartex" xmlns:cx2="http://schemas.microsoft.com/office/drawing/2015/10/21/chartex" xmlns:cx3="http://schemas.microsoft.com/office/drawing/2016/5/9/chartex" xmlns:cx4="http://schemas.microsoft.com/office/drawing/2016/5/10/chartex" xmlns:cx5="http://schemas.microsoft.com/office/drawing/2016/5/11/chartex" xmlns:cx6="http://schemas.microsoft.com/office/drawing/2016/5/12/chartex" xmlns:cx7="http://schemas.microsoft.com/office/drawing/2016/5/13/chartex" xmlns:cx8="http://schemas.microsoft.com/office/drawing/2016/5/14/chartex" xmlns:mc="http://schemas.openxmlformats.org/markup-compatibility/2006" xmlns:aink="http://schemas.microsoft.com/office/drawing/2016/ink" xmlns:am3d="http://schemas.microsoft.com/office/drawing/2017/model3d" xmlns:o="urn:schemas-microsoft-com:office:office" xmlns:oel="http://schemas.microsoft.com/office/2019/extlst" xmlns:r="http://schemas.openxmlformats.org/officeDocument/2006/relationships" xmlns:m="http://schemas.openxmlformats.org/officeDocument/2006/math" xmlns:v="urn:schemas-microsoft-com:vml" xmlns:wp14="http://schemas.microsoft.com/office/word/2010/wordprocessingDrawing" xmlns:wp="http://schemas.openxmlformats.org/drawingml/2006/wordprocessingDrawing" xmlns:w10="urn:schemas-microsoft-com:office:word" xmlns:w="http://schemas.openxmlformats.org/wordprocessingml/2006/main" xmlns:w14="http://schemas.microsoft.com/office/word/2010/wordml" xmlns:w15="http://schemas.microsoft.com/office/word/2012/wordml" xmlns:w16cei="http://schemas.microsoft.com/office/word/2026/wordml/cei" xmlns:w16cex="http://schemas.microsoft.com/office/word/2018/wordml/cex" xmlns:w16cid="http://schemas.microsoft.com/office/word/2016/wordml/cid" xmlns:w16="http://schemas.microsoft.com/office/word/2018/wordml" xmlns:w16du="http://schemas.microsoft.com/office/word/2023/wordml/word16du" xmlns:w16sdtdh="http://schemas.microsoft.com/office/word/2020/wordml/sdtdatahash" xmlns:w16sdtfl="http://schemas.microsoft.com/office/word/2024/wordml/sdtformatlock" xmlns:w16se="http://schemas.microsoft.com/office/word/2015/wordml/symex" xmlns:wpg="http://schemas.microsoft.com/office/word/2010/wordprocessingGroup" xmlns:wpi="http://schemas.microsoft.com/office/word/2010/wordprocessingInk" xmlns:wne="http://schemas.microsoft.com/office/word/2006/wordml" xmlns:wps="http://schemas.microsoft.com/office/word/2010/wordprocessingShape" mc:Ignorable="w14 w15 w16se w16cid w16 w16cex w16sdtdh w16sdtfl w16du wp14">
   <w:p>
     <w:pPr>
       <w:jc w:val="right"/>
@@ -12397,7 +11658,7 @@
 </file>
 
 <file path=word/numbering.xml><?xml version="1.0" encoding="utf-8"?>
-<w:numbering xmlns:wpc="http://schemas.microsoft.com/office/word/2010/wordprocessingCanvas" xmlns:cx="http://schemas.microsoft.com/office/drawing/2014/chartex" xmlns:cx1="http://schemas.microsoft.com/office/drawing/2015/9/8/chartex" xmlns:cx2="http://schemas.microsoft.com/office/drawing/2015/10/21/chartex" xmlns:cx3="http://schemas.microsoft.com/office/drawing/2016/5/9/chartex" xmlns:cx4="http://schemas.microsoft.com/office/drawing/2016/5/10/chartex" xmlns:cx5="http://schemas.microsoft.com/office/drawing/2016/5/11/chartex" xmlns:cx6="http://schemas.microsoft.com/office/drawing/2016/5/12/chartex" xmlns:cx7="http://schemas.microsoft.com/office/drawing/2016/5/13/chartex" xmlns:cx8="http://schemas.microsoft.com/office/drawing/2016/5/14/chartex" xmlns:mc="http://schemas.openxmlformats.org/markup-compatibility/2006" xmlns:aink="http://schemas.microsoft.com/office/drawing/2016/ink" xmlns:am3d="http://schemas.microsoft.com/office/drawing/2017/model3d" xmlns:o="urn:schemas-microsoft-com:office:office" xmlns:oel="http://schemas.microsoft.com/office/2019/extlst" xmlns:r="http://schemas.openxmlformats.org/officeDocument/2006/relationships" xmlns:m="http://schemas.openxmlformats.org/officeDocument/2006/math" xmlns:v="urn:schemas-microsoft-com:vml" xmlns:wp14="http://schemas.microsoft.com/office/word/2010/wordprocessingDrawing" xmlns:wp="http://schemas.openxmlformats.org/drawingml/2006/wordprocessingDrawing" xmlns:w10="urn:schemas-microsoft-com:office:word" xmlns:w="http://schemas.openxmlformats.org/wordprocessingml/2006/main" xmlns:w14="http://schemas.microsoft.com/office/word/2010/wordml" xmlns:w15="http://schemas.microsoft.com/office/word/2012/wordml" xmlns:w16cex="http://schemas.microsoft.com/office/word/2018/wordml/cex" xmlns:w16cid="http://schemas.microsoft.com/office/word/2016/wordml/cid" xmlns:w16="http://schemas.microsoft.com/office/word/2018/wordml" xmlns:w16du="http://schemas.microsoft.com/office/word/2023/wordml/word16du" xmlns:w16sdtdh="http://schemas.microsoft.com/office/word/2020/wordml/sdtdatahash" xmlns:w16sdtfl="http://schemas.microsoft.com/office/word/2024/wordml/sdtformatlock" xmlns:w16se="http://schemas.microsoft.com/office/word/2015/wordml/symex" xmlns:wpg="http://schemas.microsoft.com/office/word/2010/wordprocessingGroup" xmlns:wpi="http://schemas.microsoft.com/office/word/2010/wordprocessingInk" xmlns:wne="http://schemas.microsoft.com/office/word/2006/wordml" xmlns:wps="http://schemas.microsoft.com/office/word/2010/wordprocessingShape" mc:Ignorable="w14 w15 w16se w16cid w16 w16cex w16sdtdh w16sdtfl w16du wp14">
+<w:numbering xmlns:wpc="http://schemas.microsoft.com/office/word/2010/wordprocessingCanvas" xmlns:cx="http://schemas.microsoft.com/office/drawing/2014/chartex" xmlns:cx1="http://schemas.microsoft.com/office/drawing/2015/9/8/chartex" xmlns:cx2="http://schemas.microsoft.com/office/drawing/2015/10/21/chartex" xmlns:cx3="http://schemas.microsoft.com/office/drawing/2016/5/9/chartex" xmlns:cx4="http://schemas.microsoft.com/office/drawing/2016/5/10/chartex" xmlns:cx5="http://schemas.microsoft.com/office/drawing/2016/5/11/chartex" xmlns:cx6="http://schemas.microsoft.com/office/drawing/2016/5/12/chartex" xmlns:cx7="http://schemas.microsoft.com/office/drawing/2016/5/13/chartex" xmlns:cx8="http://schemas.microsoft.com/office/drawing/2016/5/14/chartex" xmlns:mc="http://schemas.openxmlformats.org/markup-compatibility/2006" xmlns:aink="http://schemas.microsoft.com/office/drawing/2016/ink" xmlns:am3d="http://schemas.microsoft.com/office/drawing/2017/model3d" xmlns:o="urn:schemas-microsoft-com:office:office" xmlns:oel="http://schemas.microsoft.com/office/2019/extlst" xmlns:r="http://schemas.openxmlformats.org/officeDocument/2006/relationships" xmlns:m="http://schemas.openxmlformats.org/officeDocument/2006/math" xmlns:v="urn:schemas-microsoft-com:vml" xmlns:wp14="http://schemas.microsoft.com/office/word/2010/wordprocessingDrawing" xmlns:wp="http://schemas.openxmlformats.org/drawingml/2006/wordprocessingDrawing" xmlns:w10="urn:schemas-microsoft-com:office:word" xmlns:w="http://schemas.openxmlformats.org/wordprocessingml/2006/main" xmlns:w14="http://schemas.microsoft.com/office/word/2010/wordml" xmlns:w15="http://schemas.microsoft.com/office/word/2012/wordml" xmlns:w16cei="http://schemas.microsoft.com/office/word/2026/wordml/cei" xmlns:w16cex="http://schemas.microsoft.com/office/word/2018/wordml/cex" xmlns:w16cid="http://schemas.microsoft.com/office/word/2016/wordml/cid" xmlns:w16="http://schemas.microsoft.com/office/word/2018/wordml" xmlns:w16du="http://schemas.microsoft.com/office/word/2023/wordml/word16du" xmlns:w16sdtdh="http://schemas.microsoft.com/office/word/2020/wordml/sdtdatahash" xmlns:w16sdtfl="http://schemas.microsoft.com/office/word/2024/wordml/sdtformatlock" xmlns:w16se="http://schemas.microsoft.com/office/word/2015/wordml/symex" xmlns:wpg="http://schemas.microsoft.com/office/word/2010/wordprocessingGroup" xmlns:wpi="http://schemas.microsoft.com/office/word/2010/wordprocessingInk" xmlns:wne="http://schemas.microsoft.com/office/word/2006/wordml" xmlns:wps="http://schemas.microsoft.com/office/word/2010/wordprocessingShape" mc:Ignorable="w14 w15 w16se w16cid w16 w16cex w16sdtdh w16sdtfl w16du wp14">
   <w:abstractNum w:abstractNumId="0" w15:restartNumberingAfterBreak="0">
     <w:nsid w:val="21D81A1F"/>
     <w:multiLevelType w:val="hybridMultilevel"/>

</xml_diff>